<commit_message>
Publish renumbered four-family supplement
</commit_message>
<xml_diff>
--- a/output/manuscript/Main-analysis.docx
+++ b/output/manuscript/Main-analysis.docx
@@ -70,7 +70,7 @@
         <w:keepLines/>
       </w:pPr>
       <w:r>
-        <w:t xml:space="preserve">Figure 5 distinguishes five-level from collapsed signalling-answer agreement on paired eligible components. In D3 against Human Review 1, the five-level difference is −10.3 points (95% CI, −17.2 to −3.2), whereas the collapsed difference is +8.5 (3.5–13.7), both on 165 components. D5 collapsed gains are +11.3 points for Human Review 1 and +3.7 (−0.3 to 7.4) for Human Review 2. eTable 6 retains source-specific domain summaries, eligibility accounting and complete paired question contrasts for both codings, including sparse and unfavorable results.</w:t>
+        <w:t xml:space="preserve">Figure 5 distinguishes five-level from collapsed signalling-answer agreement on paired eligible components. In D3 against Human Review 1, the five-level difference is −10.3 points (95% CI, −17.2 to −3.2), whereas the collapsed difference is +8.5 (3.5–13.7), both on 165 components. D5 collapsed gains are +11.3 points for Human Review 1 and +3.7 (−0.3 to 7.4) for Human Review 2. eTable 4 retains source-specific domain summaries, eligibility accounting and complete paired question contrasts for both codings, including sparse and unfavorable results.</w:t>
       </w:r>
     </w:p>
     <w:p>
@@ -125,7 +125,7 @@
               <a:graphicData uri="http://schemas.openxmlformats.org/drawingml/2006/picture">
                 <pic:pic>
                   <pic:nvPicPr>
-                    <pic:cNvPr descr="C:\Users\ALI-SA~1\AppData\Local\Temp\arbiter-analysis-word-sv9nzcjq\Figure1.png" id="14" name="Picture"/>
+                    <pic:cNvPr descr="C:\Users\ALI-SA~1\AppData\Local\Temp\arbiter-analysis-word-zqdb1zj1\Figure1.png" id="14" name="Picture"/>
                     <pic:cNvPicPr>
                       <a:picLocks noChangeArrowheads="1" noChangeAspect="1"/>
                     </pic:cNvPicPr>
@@ -194,7 +194,7 @@
               <a:graphicData uri="http://schemas.openxmlformats.org/drawingml/2006/picture">
                 <pic:pic>
                   <pic:nvPicPr>
-                    <pic:cNvPr descr="C:\Users\ALI-SA~1\AppData\Local\Temp\arbiter-analysis-word-sv9nzcjq\Figure2.png" id="18" name="Picture"/>
+                    <pic:cNvPr descr="C:\Users\ALI-SA~1\AppData\Local\Temp\arbiter-analysis-word-zqdb1zj1\Figure2.png" id="18" name="Picture"/>
                     <pic:cNvPicPr>
                       <a:picLocks noChangeArrowheads="1" noChangeAspect="1"/>
                     </pic:cNvPicPr>
@@ -293,7 +293,7 @@
               <a:graphicData uri="http://schemas.openxmlformats.org/drawingml/2006/picture">
                 <pic:pic>
                   <pic:nvPicPr>
-                    <pic:cNvPr descr="C:\Users\ALI-SA~1\AppData\Local\Temp\arbiter-analysis-word-sv9nzcjq\Figure3.png" id="24" name="Picture"/>
+                    <pic:cNvPr descr="C:\Users\ALI-SA~1\AppData\Local\Temp\arbiter-analysis-word-zqdb1zj1\Figure3.png" id="24" name="Picture"/>
                     <pic:cNvPicPr>
                       <a:picLocks noChangeArrowheads="1" noChangeAspect="1"/>
                     </pic:cNvPicPr>
@@ -362,7 +362,7 @@
               <a:graphicData uri="http://schemas.openxmlformats.org/drawingml/2006/picture">
                 <pic:pic>
                   <pic:nvPicPr>
-                    <pic:cNvPr descr="C:\Users\ALI-SA~1\AppData\Local\Temp\arbiter-analysis-word-sv9nzcjq\Figure4.png" id="28" name="Picture"/>
+                    <pic:cNvPr descr="C:\Users\ALI-SA~1\AppData\Local\Temp\arbiter-analysis-word-zqdb1zj1\Figure4.png" id="28" name="Picture"/>
                     <pic:cNvPicPr>
                       <a:picLocks noChangeArrowheads="1" noChangeAspect="1"/>
                     </pic:cNvPicPr>
@@ -431,7 +431,7 @@
               <a:graphicData uri="http://schemas.openxmlformats.org/drawingml/2006/picture">
                 <pic:pic>
                   <pic:nvPicPr>
-                    <pic:cNvPr descr="C:\Users\ALI-SA~1\AppData\Local\Temp\arbiter-analysis-word-sv9nzcjq\Figure5.png" id="32" name="Picture"/>
+                    <pic:cNvPr descr="C:\Users\ALI-SA~1\AppData\Local\Temp\arbiter-analysis-word-zqdb1zj1\Figure5.png" id="32" name="Picture"/>
                     <pic:cNvPicPr>
                       <a:picLocks noChangeArrowheads="1" noChangeAspect="1"/>
                     </pic:cNvPicPr>
@@ -470,7 +470,7 @@
         <w:keepLines/>
       </w:pPr>
       <w:r>
-        <w:t xml:space="preserve">Figure 5. Paired signalling-answer diagnostics. Rows cover all five domains against each human reviewer; n is the number of question components evaluable in both arms. Diamonds and bars show ARBITER minus Unassisted exact agreement and 95% intervals. Five-level matching distinguishes yes, probably yes, no, probably no and no information. Collapsed matching combines yes/probably yes and no/probably no, leaving no information separate. These are different estimands. D1: randomisation process; D2: deviations from intended interventions; D3: missing outcome data; D4: outcome measurement; D5: selection of the reported result. D3 and D5 illustrate reference dependence and the effect of coding. eTable 6 contains source-specific domain summaries, complete paired question contrasts and eligibility accounting for both codings. CI, 95% confidence interval; 10,000 percentile bootstrap replicates, trials resampled within meta-analysis; seed 20261018.</w:t>
+        <w:t xml:space="preserve">Figure 5. Paired signalling-answer diagnostics. Rows cover all five domains against each human reviewer; n is the number of question components evaluable in both arms. Diamonds and bars show ARBITER minus Unassisted exact agreement and 95% intervals. Five-level matching distinguishes yes, probably yes, no, probably no and no information. Collapsed matching combines yes/probably yes and no/probably no, leaving no information separate. These are different estimands. D1: randomisation process; D2: deviations from intended interventions; D3: missing outcome data; D4: outcome measurement; D5: selection of the reported result. D3 and D5 illustrate reference dependence and the effect of coding. eTable 4 contains source-specific domain summaries, complete paired question contrasts and eligibility accounting for both codings. CI, 95% confidence interval; 10,000 percentile bootstrap replicates, trials resampled within meta-analysis; seed 20261018.</w:t>
       </w:r>
     </w:p>
     <w:bookmarkEnd w:id="33"/>

</xml_diff>

<commit_message>
Publish updated figures, tables and post hoc supplement
</commit_message>
<xml_diff>
--- a/output/manuscript/Main-analysis.docx
+++ b/output/manuscript/Main-analysis.docx
@@ -37,7 +37,7 @@
         <w:pStyle w:val="FirstParagraph"/>
       </w:pPr>
       <w:r>
-        <w:t xml:space="preserve">The benchmark included 102 trials from 16 reviews and 510 domain cells after exclusion of three unsupported designs (Figure 3; Table 1). Both human reviewers independently assessed every cell.</w:t>
+        <w:t xml:space="preserve">The benchmark included 102 trials from 16 reviews and 510 domain cells after exclusion of three unsupported designs (Figure 3; Table 2). Both human reviewers independently assessed every cell.</w:t>
       </w:r>
     </w:p>
     <w:p>
@@ -45,7 +45,7 @@
         <w:pStyle w:val="BodyText"/>
       </w:pPr>
       <w:r>
-        <w:t xml:space="preserve">Against Published across all 510 cells, exact agreement is 386/510 (75.7%) for ARBITER versus 395/510 (77.5%) for Unassisted, a paired difference of −1.8 points (95% CI, −5.1 to 1.6).</w:t>
+        <w:t xml:space="preserve">Against Published across all 510 cells, exact agreement is 386/510 (75.7%) for ARBITER versus 395/510 (77.5%) for Direct prompting, a paired difference of −1.8 points (95% CI, −5.1 to 1.6).</w:t>
       </w:r>
     </w:p>
     <w:p>
@@ -53,7 +53,7 @@
         <w:pStyle w:val="BodyText"/>
       </w:pPr>
       <w:r>
-        <w:t xml:space="preserve">Human Review 1: ARBITER 371/510 (72.7%) versus Unassisted 332/510 (65.1%); paired gain 7.6 (5.1–10.2) percentage points. Human Review 2: ARBITER 433/510 (84.9%) versus Unassisted 400/510 (78.4%); paired gain 6.5 (3.5–9.4) percentage points. Figure 4 shows absolute levels and paired gains, with the largest observed gains in D5. D3 remains strongly reference-dependent: ARBITER matches 43/102 ratings from Human Review 1 and 80/102 from Human Review 2. The human reviewers agree on 54/102 D3 cells.</w:t>
+        <w:t xml:space="preserve">Human Review 1: ARBITER 371/510 (72.7%) versus Direct prompting 332/510 (65.1%); paired gain 7.6 (5.1–10.2) percentage points. Human Review 2: ARBITER 433/510 (84.9%) versus Direct prompting 400/510 (78.4%); paired gain 6.5 (3.5–9.4) percentage points. Figure 4 shows absolute levels and paired gains, with the largest observed gains in D5. D3 remains strongly reference-dependent: ARBITER matches 43/102 ratings from Human Review 1 and 80/102 from Human Review 2. The human reviewers agree on 54/102 D3 cells.</w:t>
       </w:r>
     </w:p>
     <w:p>
@@ -61,7 +61,7 @@
         <w:pStyle w:val="BodyText"/>
       </w:pPr>
       <w:r>
-        <w:t xml:space="preserve">Conditional blinded-label choices favored ARBITER in 53/60 agreed choices (88%; 95% CI, 80–96%). These 60 agreed choices arose from 80 arm-cells where the two arms disagreed, with 20 split choices. Review-specific and split-loss sensitivities are in Table 2.</w:t>
+        <w:t xml:space="preserve">Conditional blinded-label choices favored ARBITER in 53/60 agreed choices (88%; 95% CI, 80–96%). These 60 agreed choices arose from 80 arm-cells where the two arms disagreed, with 20 split choices. Review-specific and split-loss sensitivities are in Table 4.</w:t>
       </w:r>
     </w:p>
     <w:p>
@@ -78,7 +78,7 @@
         <w:pStyle w:val="BodyText"/>
       </w:pPr>
       <w:r>
-        <w:t xml:space="preserve">Table 3 reports process conformance and computational resources. All 510 ARBITER domain outputs reproduce from the rule engine; Unassisted has 65/509 evaluable rule breaks (26 contradictory ratings and 39 required-question omissions). In separate structural checks, all 1538 active required answers cite evidence; 1407/1407 text spans and 14 image records are source-bound, and 102 bundles pass structural verification. These checks do not establish semantic support.</w:t>
+        <w:t xml:space="preserve">Table 3 reports process conformance and computational resources. All 510 ARBITER domain outputs reproduce from the rule engine; Direct prompting has 65/509 evaluable rule breaks (26 contradictory ratings and 39 required-question omissions). In separate structural checks, all 1538 active required answers cite evidence; 1407/1407 text spans and 14 image records are source-bound, and 102 bundles pass structural verification. These checks do not establish semantic support.</w:t>
       </w:r>
     </w:p>
     <w:p>
@@ -125,7 +125,7 @@
               <a:graphicData uri="http://schemas.openxmlformats.org/drawingml/2006/picture">
                 <pic:pic>
                   <pic:nvPicPr>
-                    <pic:cNvPr descr="C:\Users\ALI-SA~1\AppData\Local\Temp\arbiter-analysis-word-zqdb1zj1\Figure1.png" id="14" name="Picture"/>
+                    <pic:cNvPr descr="C:\Users\ALI-SA~1\AppData\Local\Temp\arbiter-analysis-word-h2yl2cwo\Figure1.png" id="14" name="Picture"/>
                     <pic:cNvPicPr>
                       <a:picLocks noChangeArrowheads="1" noChangeAspect="1"/>
                     </pic:cNvPicPr>
@@ -194,7 +194,7 @@
               <a:graphicData uri="http://schemas.openxmlformats.org/drawingml/2006/picture">
                 <pic:pic>
                   <pic:nvPicPr>
-                    <pic:cNvPr descr="C:\Users\ALI-SA~1\AppData\Local\Temp\arbiter-analysis-word-zqdb1zj1\Figure2.png" id="18" name="Picture"/>
+                    <pic:cNvPr descr="C:\Users\ALI-SA~1\AppData\Local\Temp\arbiter-analysis-word-h2yl2cwo\Figure2.png" id="18" name="Picture"/>
                     <pic:cNvPicPr>
                       <a:picLocks noChangeArrowheads="1" noChangeAspect="1"/>
                     </pic:cNvPicPr>
@@ -288,12 +288,12 @@
           <wp:inline>
             <wp:extent cx="6047653" cy="6080760"/>
             <wp:effectExtent b="0" l="0" r="0" t="0"/>
-            <wp:docPr descr="Three parallel assessment lanes for ARBITER, Unassisted and two independent human reviews across 102 trials and 510 domain cells. A separate conditional branch contains 80 arm-discordant cells, 60 agreed choices and 20 splits." title="" id="23" name="Picture"/>
+            <wp:docPr descr="Three parallel assessment lanes for ARBITER, Direct prompting and two independent human reviews across 102 trials and 510 domain cells. A separate conditional branch contains 80 arm-discordant cells, 60 agreed choices and 20 splits." title="" id="23" name="Picture"/>
             <a:graphic>
               <a:graphicData uri="http://schemas.openxmlformats.org/drawingml/2006/picture">
                 <pic:pic>
                   <pic:nvPicPr>
-                    <pic:cNvPr descr="C:\Users\ALI-SA~1\AppData\Local\Temp\arbiter-analysis-word-zqdb1zj1\Figure3.png" id="24" name="Picture"/>
+                    <pic:cNvPr descr="C:\Users\ALI-SA~1\AppData\Local\Temp\arbiter-analysis-word-h2yl2cwo\Figure3.png" id="24" name="Picture"/>
                     <pic:cNvPicPr>
                       <a:picLocks noChangeArrowheads="1" noChangeAspect="1"/>
                     </pic:cNvPicPr>
@@ -332,7 +332,7 @@
         <w:keepLines/>
       </w:pPr>
       <w:r>
-        <w:t xml:space="preserve">Figure 3. Parallel assessment lanes and conditional blinded-label choices. ARBITER, Unassisted and Human Reviewers assess the same benchmark. Both AI arms assessed the same 102 trials using the same reported model identifier and supplied documents. Two human reviewers independently recorded ratings and signalling answers for all 510 trial-domain cells before viewing labels. In a separate stage, each chose among three labels presented in random order without rationales. The conditional choice estimate uses 60 agreed choices from 80 arm-cells where the two arms disagreed; 20 split choices enter sensitivities. The all-cell human reviewer comparisons are not restricted to that conditional population. Counts are trials or cells as indicated; no interval applies.</w:t>
+        <w:t xml:space="preserve">Figure 3. Parallel assessment lanes and conditional blinded-label choices. ARBITER, Direct prompting and Human Reviewers assess the same benchmark. Both AI arms assessed the same 102 trials using the same reported model identifier and supplied documents. Two human reviewers independently recorded ratings and signalling answers for all 510 trial-domain cells before viewing labels. In a separate stage, each chose among three labels presented in random order without rationales. The conditional choice estimate uses 60 agreed choices from 80 arm-cells where the two arms disagreed; 20 split choices enter sensitivities. The all-cell human reviewer comparisons are not restricted to that conditional population. Counts are trials or cells as indicated; no interval applies.</w:t>
       </w:r>
     </w:p>
     <w:bookmarkEnd w:id="25"/>
@@ -362,7 +362,7 @@
               <a:graphicData uri="http://schemas.openxmlformats.org/drawingml/2006/picture">
                 <pic:pic>
                   <pic:nvPicPr>
-                    <pic:cNvPr descr="C:\Users\ALI-SA~1\AppData\Local\Temp\arbiter-analysis-word-zqdb1zj1\Figure4.png" id="28" name="Picture"/>
+                    <pic:cNvPr descr="C:\Users\ALI-SA~1\AppData\Local\Temp\arbiter-analysis-word-h2yl2cwo\Figure4.png" id="28" name="Picture"/>
                     <pic:cNvPicPr>
                       <a:picLocks noChangeArrowheads="1" noChangeAspect="1"/>
                     </pic:cNvPicPr>
@@ -401,7 +401,7 @@
         <w:keepLines/>
       </w:pPr>
       <w:r>
-        <w:t xml:space="preserve">Figure 4. Absolute and paired domain agreement with each independent human reviewer. Blue circles denote ARBITER and orange squares Unassisted. Left panels show exact agreement with 95% intervals on a 0–100% scale; right panels show paired ARBITER minus Unassisted differences in percentage points, with neutral diamonds and zero lines. Each human reviewer contributes 510 pooled cells and 102 per domain. Between human reviews agreement is 388/510 (76.1%; weighted κ 0.59), context rather than a performance ceiling. The compact Published comparison retains all 510 cells. D1: randomisation process; D2: deviations from intended interventions; D3: missing outcome data; D4: outcome measurement; D5: selection of the reported result. CI, 95% confidence interval; 10,000 percentile bootstrap replicates, trials resampled within meta-analysis; seed 20261018.</w:t>
+        <w:t xml:space="preserve">Figure 4. Absolute and paired domain agreement with each independent human reviewer. Blue circles denote ARBITER and orange squares Direct prompting. Left panels show exact agreement with 95% intervals on a 0–100% scale; right panels show paired ARBITER minus Direct prompting differences in percentage points, with neutral diamonds and zero lines. Each human reviewer contributes 510 pooled cells and 102 per domain. Between human reviews agreement is 388/510 (76.1%; weighted κ 0.59), context rather than a performance ceiling. The compact Published comparison retains all 510 cells. D1: randomisation process; D2: deviations from intended interventions; D3: missing outcome data; D4: outcome measurement; D5: selection of the reported result. CI, 95% confidence interval; 10,000 percentile bootstrap replicates, trials resampled within meta-analysis; seed 20261018.</w:t>
       </w:r>
     </w:p>
     <w:bookmarkEnd w:id="29"/>
@@ -431,7 +431,7 @@
               <a:graphicData uri="http://schemas.openxmlformats.org/drawingml/2006/picture">
                 <pic:pic>
                   <pic:nvPicPr>
-                    <pic:cNvPr descr="C:\Users\ALI-SA~1\AppData\Local\Temp\arbiter-analysis-word-zqdb1zj1\Figure5.png" id="32" name="Picture"/>
+                    <pic:cNvPr descr="C:\Users\ALI-SA~1\AppData\Local\Temp\arbiter-analysis-word-h2yl2cwo\Figure5.png" id="32" name="Picture"/>
                     <pic:cNvPicPr>
                       <a:picLocks noChangeArrowheads="1" noChangeAspect="1"/>
                     </pic:cNvPicPr>
@@ -470,7 +470,7 @@
         <w:keepLines/>
       </w:pPr>
       <w:r>
-        <w:t xml:space="preserve">Figure 5. Paired signalling-answer diagnostics. Rows cover all five domains against each human reviewer; n is the number of question components evaluable in both arms. Diamonds and bars show ARBITER minus Unassisted exact agreement and 95% intervals. Five-level matching distinguishes yes, probably yes, no, probably no and no information. Collapsed matching combines yes/probably yes and no/probably no, leaving no information separate. These are different estimands. D1: randomisation process; D2: deviations from intended interventions; D3: missing outcome data; D4: outcome measurement; D5: selection of the reported result. D3 and D5 illustrate reference dependence and the effect of coding. eTable 4 contains source-specific domain summaries, complete paired question contrasts and eligibility accounting for both codings. CI, 95% confidence interval; 10,000 percentile bootstrap replicates, trials resampled within meta-analysis; seed 20261018.</w:t>
+        <w:t xml:space="preserve">Figure 5. Paired signalling-answer diagnostics. Rows cover all five domains against each human reviewer; n is the number of question components evaluable in both arms. Diamonds and bars show ARBITER minus Direct prompting exact agreement and 95% intervals. Five-level matching distinguishes yes, probably yes, no, probably no and no information. Collapsed matching combines yes/probably yes and no/probably no, leaving no information separate. These are different estimands. D1: randomisation process; D2: deviations from intended interventions; D3: missing outcome data; D4: outcome measurement; D5: selection of the reported result. D3 and D5 illustrate reference dependence and the effect of coding. eTable 4 contains source-specific domain summaries, complete paired question contrasts and eligibility accounting for both codings. CI, 95% confidence interval; 10,000 percentile bootstrap replicates, trials resampled within meta-analysis; seed 20261018.</w:t>
       </w:r>
     </w:p>
     <w:bookmarkEnd w:id="33"/>
@@ -485,14 +485,14 @@
         <w:t xml:space="preserve">Tables</w:t>
       </w:r>
     </w:p>
-    <w:bookmarkStart w:id="36" w:name="table-1"/>
+    <w:bookmarkStart w:id="36" w:name="table-2"/>
     <w:p>
       <w:pPr>
         <w:pStyle w:val="Heading2"/>
         <w:pageBreakBefore w:val="0"/>
       </w:pPr>
       <w:r>
-        <w:t xml:space="preserve">Table 1. Benchmark and</w:t>
+        <w:t xml:space="preserve">Table 2. Benchmark and</w:t>
       </w:r>
       <w:r>
         <w:t xml:space="preserve"> </w:t>
@@ -1071,7 +1071,7 @@
                 <w:rFonts w:ascii="Arial" w:hAnsi="Arial"/>
                 <w:sz w:val="20"/>
               </w:rPr>
-              <w:t xml:space="default">D1–D5: Published</w:t>
+              <w:t xml:space="default">D1–D5: Human Review 1</w:t>
             </w:r>
           </w:p>
         </w:tc>
@@ -1101,7 +1101,7 @@
                 <w:rFonts w:ascii="Arial" w:hAnsi="Arial"/>
                 <w:sz w:val="20"/>
               </w:rPr>
-              <w:t xml:space="default">Low: 427/510 (83.7%); Some concerns: 69/510 (13.5%); High: 14/510 (2.7%)</w:t>
+              <w:t xml:space="default">Low: 277/510 (54.3%); Some concerns: 163/510 (32.0%); High: 70/510 (13.7%)</w:t>
             </w:r>
           </w:p>
         </w:tc>
@@ -1136,7 +1136,7 @@
                 <w:rFonts w:ascii="Arial" w:hAnsi="Arial"/>
                 <w:sz w:val="20"/>
               </w:rPr>
-              <w:t xml:space="default">D1–D5: Human Review 1</w:t>
+              <w:t xml:space="default">D1–D5: Human Review 2</w:t>
             </w:r>
           </w:p>
         </w:tc>
@@ -1166,7 +1166,7 @@
                 <w:rFonts w:ascii="Arial" w:hAnsi="Arial"/>
                 <w:sz w:val="20"/>
               </w:rPr>
-              <w:t xml:space="default">Low: 277/510 (54.3%); Some concerns: 163/510 (32.0%); High: 70/510 (13.7%)</w:t>
+              <w:t xml:space="default">Low: 346/510 (67.8%); Some concerns: 131/510 (25.7%); High: 33/510 (6.5%)</w:t>
             </w:r>
           </w:p>
         </w:tc>
@@ -1201,7 +1201,7 @@
                 <w:rFonts w:ascii="Arial" w:hAnsi="Arial"/>
                 <w:sz w:val="20"/>
               </w:rPr>
-              <w:t xml:space="default">D1–D5: Human Review 2</w:t>
+              <w:t xml:space="default">D1–D5: Published</w:t>
             </w:r>
           </w:p>
         </w:tc>
@@ -1231,7 +1231,7 @@
                 <w:rFonts w:ascii="Arial" w:hAnsi="Arial"/>
                 <w:sz w:val="20"/>
               </w:rPr>
-              <w:t xml:space="default">Low: 346/510 (67.8%); Some concerns: 131/510 (25.7%); High: 33/510 (6.5%)</w:t>
+              <w:t xml:space="default">Low: 427/510 (83.7%); Some concerns: 69/510 (13.5%); High: 14/510 (2.7%)</w:t>
             </w:r>
           </w:p>
         </w:tc>
@@ -1242,6 +1242,136 @@
         </w:trPr>
         <w:tc>
           <w:tcPr>
+            <w:tcW w:type="dxa" w:w="3354"/>
+            <w:tcMar>
+              <w:top w:type="dxa" w:w="35"/>
+              <w:bottom w:type="dxa" w:w="35"/>
+              <w:start w:type="dxa" w:w="70"/>
+              <w:end w:type="dxa" w:w="70"/>
+            </w:tcMar>
+            <w:tcBorders>
+              <w:top w:val="nil" w:sz="0" w:color="666666"/>
+              <w:bottom w:val="nil" w:sz="0" w:color="666666"/>
+              <w:start w:val="nil" w:sz="0" w:color="666666"/>
+              <w:end w:val="nil" w:sz="0" w:color="666666"/>
+            </w:tcBorders>
+          </w:tcPr>
+          <w:p>
+            <w:pPr>
+              <w:spacing w:before="0" w:after="60"/>
+              <w:jc w:val="start"/>
+            </w:pPr>
+            <w:r>
+              <w:rPr>
+                <w:rFonts w:ascii="Arial" w:hAnsi="Arial"/>
+                <w:sz w:val="20"/>
+              </w:rPr>
+              <w:t xml:space="default">D1–D5: ARBITER</w:t>
+            </w:r>
+          </w:p>
+        </w:tc>
+        <w:tc>
+          <w:tcPr>
+            <w:tcW w:type="dxa" w:w="6510"/>
+            <w:tcMar>
+              <w:top w:type="dxa" w:w="35"/>
+              <w:bottom w:type="dxa" w:w="35"/>
+              <w:start w:type="dxa" w:w="70"/>
+              <w:end w:type="dxa" w:w="70"/>
+            </w:tcMar>
+            <w:tcBorders>
+              <w:top w:val="nil" w:sz="0" w:color="666666"/>
+              <w:bottom w:val="nil" w:sz="0" w:color="666666"/>
+              <w:start w:val="nil" w:sz="0" w:color="666666"/>
+              <w:end w:val="nil" w:sz="0" w:color="666666"/>
+            </w:tcBorders>
+          </w:tcPr>
+          <w:p>
+            <w:pPr>
+              <w:spacing w:before="0" w:after="60"/>
+              <w:jc w:val="start"/>
+            </w:pPr>
+            <w:r>
+              <w:rPr>
+                <w:rFonts w:ascii="Arial" w:hAnsi="Arial"/>
+                <w:sz w:val="20"/>
+              </w:rPr>
+              <w:t xml:space="default">Low: 375/510 (73.5%); Some concerns: 114/510 (22.4%); High: 21/510 (4.1%)</w:t>
+            </w:r>
+          </w:p>
+        </w:tc>
+      </w:tr>
+      <w:tr>
+        <w:trPr>
+          <w:cantSplit/>
+        </w:trPr>
+        <w:tc>
+          <w:tcPr>
+            <w:tcW w:type="dxa" w:w="3354"/>
+            <w:tcMar>
+              <w:top w:type="dxa" w:w="35"/>
+              <w:bottom w:type="dxa" w:w="35"/>
+              <w:start w:type="dxa" w:w="70"/>
+              <w:end w:type="dxa" w:w="70"/>
+            </w:tcMar>
+            <w:tcBorders>
+              <w:top w:val="nil" w:sz="0" w:color="666666"/>
+              <w:bottom w:val="nil" w:sz="0" w:color="666666"/>
+              <w:start w:val="nil" w:sz="0" w:color="666666"/>
+              <w:end w:val="nil" w:sz="0" w:color="666666"/>
+            </w:tcBorders>
+          </w:tcPr>
+          <w:p>
+            <w:pPr>
+              <w:spacing w:before="0" w:after="60"/>
+              <w:jc w:val="start"/>
+            </w:pPr>
+            <w:r>
+              <w:rPr>
+                <w:rFonts w:ascii="Arial" w:hAnsi="Arial"/>
+                <w:sz w:val="20"/>
+              </w:rPr>
+              <w:t xml:space="default">D1–D5: Direct prompting</w:t>
+            </w:r>
+          </w:p>
+        </w:tc>
+        <w:tc>
+          <w:tcPr>
+            <w:tcW w:type="dxa" w:w="6510"/>
+            <w:tcMar>
+              <w:top w:type="dxa" w:w="35"/>
+              <w:bottom w:type="dxa" w:w="35"/>
+              <w:start w:type="dxa" w:w="70"/>
+              <w:end w:type="dxa" w:w="70"/>
+            </w:tcMar>
+            <w:tcBorders>
+              <w:top w:val="nil" w:sz="0" w:color="666666"/>
+              <w:bottom w:val="nil" w:sz="0" w:color="666666"/>
+              <w:start w:val="nil" w:sz="0" w:color="666666"/>
+              <w:end w:val="nil" w:sz="0" w:color="666666"/>
+            </w:tcBorders>
+          </w:tcPr>
+          <w:p>
+            <w:pPr>
+              <w:spacing w:before="0" w:after="60"/>
+              <w:jc w:val="start"/>
+            </w:pPr>
+            <w:r>
+              <w:rPr>
+                <w:rFonts w:ascii="Arial" w:hAnsi="Arial"/>
+                <w:sz w:val="20"/>
+              </w:rPr>
+              <w:t xml:space="default">Low: 407/510 (79.8%); Some concerns: 80/510 (15.7%); High: 23/510 (4.5%)</w:t>
+            </w:r>
+          </w:p>
+        </w:tc>
+      </w:tr>
+      <w:tr>
+        <w:trPr>
+          <w:cantSplit/>
+        </w:trPr>
+        <w:tc>
+          <w:tcPr>
             <w:gridSpan w:val="2"/>
             <w:tcW w:type="dxa" w:w="9864"/>
             <w:tcMar>
@@ -1266,7 +1396,7 @@
                 <w:rFonts w:ascii="Arial" w:hAnsi="Arial"/>
                 <w:sz w:val="20"/>
               </w:rPr>
-              <w:t xml:space="default">Reference categories are Low, Some concerns and High; each reference contributes 510 domain cells. Document counts are trials with each role recorded in the source inventory among 102 trials; roles can overlap. SAP, statistical analysis plan. Reference distributions and separate human reviewer agreement appear in the compact supplement.</w:t>
+              <w:t xml:space="default">Rating categories are Low, Some concerns and High; each source contributes 510 domain cells. Document counts are trials with each role recorded in the source inventory among 102 trials; roles can overlap. SAP, statistical analysis plan. Source distributions and separate human reviewer agreement appear in the compact supplement.</w:t>
             </w:r>
           </w:p>
         </w:tc>
@@ -1286,418 +1416,7 @@
       </w:hyperlink>
     </w:p>
     <w:bookmarkEnd w:id="36"/>
-    <w:bookmarkStart w:id="38" w:name="table-2"/>
-    <w:p>
-      <w:pPr>
-        <w:pStyle w:val="Heading2"/>
-        <w:pageBreakBefore/>
-      </w:pPr>
-      <w:r>
-        <w:t xml:space="preserve">Table</w:t>
-      </w:r>
-      <w:r>
-        <w:t xml:space="preserve"> </w:t>
-      </w:r>
-      <w:r>
-        <w:t xml:space="preserve">2. Conditional blinded-label choices and sensitivities</w:t>
-      </w:r>
-    </w:p>
-    <w:tbl>
-      <w:tblPr>
-        <w:tblCellMar>
-          <w:top w:w="0" w:type="dxa"/>
-          <w:bottom w:w="0" w:type="dxa"/>
-          <w:start w:w="60" w:type="dxa"/>
-          <w:end w:w="60" w:type="dxa"/>
-        </w:tblCellMar>
-        <w:tblLook w:firstRow="0" w:lastRow="0" w:firstColumn="0" w:lastColumn="0" w:noHBand="0" w:noVBand="0"/>
-        <w:jc w:val="center"/>
-        <w:tblW w:type="dxa" w:w="9864"/>
-        <w:tblLayout w:type="fixed"/>
-      </w:tblPr>
-      <w:tblGrid>
-        <w:gridCol w:w="3354"/>
-        <w:gridCol w:w="6510"/>
-      </w:tblGrid>
-      <w:tr>
-        <w:trPr>
-          <w:cantSplit/>
-          <w:tblHeader/>
-        </w:trPr>
-        <w:tc>
-          <w:tcPr>
-            <w:tcW w:type="dxa" w:w="3354"/>
-            <w:tcMar>
-              <w:top w:type="dxa" w:w="35"/>
-              <w:bottom w:type="dxa" w:w="35"/>
-              <w:start w:type="dxa" w:w="70"/>
-              <w:end w:type="dxa" w:w="70"/>
-            </w:tcMar>
-            <w:tcBorders>
-              <w:top w:val="single" w:sz="6" w:color="666666"/>
-              <w:bottom w:val="single" w:sz="6" w:color="666666"/>
-              <w:start w:val="nil" w:sz="0" w:color="666666"/>
-              <w:end w:val="nil" w:sz="0" w:color="666666"/>
-            </w:tcBorders>
-          </w:tcPr>
-          <w:p>
-            <w:pPr>
-              <w:spacing w:before="0" w:after="60"/>
-              <w:jc w:val="start"/>
-            </w:pPr>
-            <w:r>
-              <w:rPr>
-                <w:rFonts w:ascii="Arial" w:hAnsi="Arial"/>
-                <w:sz w:val="20"/>
-                <w:b/>
-              </w:rPr>
-              <w:t xml:space="default">Population</w:t>
-            </w:r>
-          </w:p>
-        </w:tc>
-        <w:tc>
-          <w:tcPr>
-            <w:tcW w:type="dxa" w:w="6510"/>
-            <w:tcMar>
-              <w:top w:type="dxa" w:w="35"/>
-              <w:bottom w:type="dxa" w:w="35"/>
-              <w:start w:type="dxa" w:w="70"/>
-              <w:end w:type="dxa" w:w="70"/>
-            </w:tcMar>
-            <w:tcBorders>
-              <w:top w:val="single" w:sz="6" w:color="666666"/>
-              <w:bottom w:val="single" w:sz="6" w:color="666666"/>
-              <w:start w:val="nil" w:sz="0" w:color="666666"/>
-              <w:end w:val="nil" w:sz="0" w:color="666666"/>
-            </w:tcBorders>
-          </w:tcPr>
-          <w:p>
-            <w:pPr>
-              <w:spacing w:before="0" w:after="60"/>
-              <w:jc w:val="end"/>
-            </w:pPr>
-            <w:r>
-              <w:rPr>
-                <w:rFonts w:ascii="Arial" w:hAnsi="Arial"/>
-                <w:sz w:val="20"/>
-                <w:b/>
-              </w:rPr>
-              <w:t xml:space="default">ARBITER, No./total (%) (95% CI)</w:t>
-            </w:r>
-          </w:p>
-        </w:tc>
-      </w:tr>
-      <w:tr>
-        <w:trPr>
-          <w:cantSplit/>
-        </w:trPr>
-        <w:tc>
-          <w:tcPr>
-            <w:tcW w:type="dxa" w:w="3354"/>
-            <w:tcMar>
-              <w:top w:type="dxa" w:w="35"/>
-              <w:bottom w:type="dxa" w:w="35"/>
-              <w:start w:type="dxa" w:w="70"/>
-              <w:end w:type="dxa" w:w="70"/>
-            </w:tcMar>
-            <w:tcBorders>
-              <w:top w:val="nil" w:sz="0" w:color="666666"/>
-              <w:bottom w:val="nil" w:sz="0" w:color="666666"/>
-              <w:start w:val="nil" w:sz="0" w:color="666666"/>
-              <w:end w:val="nil" w:sz="0" w:color="666666"/>
-            </w:tcBorders>
-          </w:tcPr>
-          <w:p>
-            <w:pPr>
-              <w:spacing w:before="0" w:after="60"/>
-              <w:jc w:val="start"/>
-            </w:pPr>
-            <w:r>
-              <w:rPr>
-                <w:rFonts w:ascii="Arial" w:hAnsi="Arial"/>
-                <w:sz w:val="20"/>
-              </w:rPr>
-              <w:t xml:space="default">Agreed choices</w:t>
-            </w:r>
-          </w:p>
-        </w:tc>
-        <w:tc>
-          <w:tcPr>
-            <w:tcW w:type="dxa" w:w="6510"/>
-            <w:tcMar>
-              <w:top w:type="dxa" w:w="35"/>
-              <w:bottom w:type="dxa" w:w="35"/>
-              <w:start w:type="dxa" w:w="70"/>
-              <w:end w:type="dxa" w:w="70"/>
-            </w:tcMar>
-            <w:tcBorders>
-              <w:top w:val="nil" w:sz="0" w:color="666666"/>
-              <w:bottom w:val="nil" w:sz="0" w:color="666666"/>
-              <w:start w:val="nil" w:sz="0" w:color="666666"/>
-              <w:end w:val="nil" w:sz="0" w:color="666666"/>
-            </w:tcBorders>
-          </w:tcPr>
-          <w:p>
-            <w:pPr>
-              <w:spacing w:before="0" w:after="60"/>
-              <w:jc w:val="end"/>
-            </w:pPr>
-            <w:r>
-              <w:rPr>
-                <w:rFonts w:ascii="Arial" w:hAnsi="Arial"/>
-                <w:sz w:val="20"/>
-              </w:rPr>
-              <w:t xml:space="default">53/60 (88%; 80–96)</w:t>
-            </w:r>
-          </w:p>
-        </w:tc>
-      </w:tr>
-      <w:tr>
-        <w:trPr>
-          <w:cantSplit/>
-        </w:trPr>
-        <w:tc>
-          <w:tcPr>
-            <w:tcW w:type="dxa" w:w="3354"/>
-            <w:tcMar>
-              <w:top w:type="dxa" w:w="35"/>
-              <w:bottom w:type="dxa" w:w="35"/>
-              <w:start w:type="dxa" w:w="70"/>
-              <w:end w:type="dxa" w:w="70"/>
-            </w:tcMar>
-            <w:tcBorders>
-              <w:top w:val="nil" w:sz="0" w:color="666666"/>
-              <w:bottom w:val="nil" w:sz="0" w:color="666666"/>
-              <w:start w:val="nil" w:sz="0" w:color="666666"/>
-              <w:end w:val="nil" w:sz="0" w:color="666666"/>
-            </w:tcBorders>
-          </w:tcPr>
-          <w:p>
-            <w:pPr>
-              <w:spacing w:before="0" w:after="60"/>
-              <w:jc w:val="start"/>
-            </w:pPr>
-            <w:r>
-              <w:rPr>
-                <w:rFonts w:ascii="Arial" w:hAnsi="Arial"/>
-                <w:sz w:val="20"/>
-              </w:rPr>
-              <w:t xml:space="default">Human Review 1</w:t>
-            </w:r>
-          </w:p>
-        </w:tc>
-        <w:tc>
-          <w:tcPr>
-            <w:tcW w:type="dxa" w:w="6510"/>
-            <w:tcMar>
-              <w:top w:type="dxa" w:w="35"/>
-              <w:bottom w:type="dxa" w:w="35"/>
-              <w:start w:type="dxa" w:w="70"/>
-              <w:end w:type="dxa" w:w="70"/>
-            </w:tcMar>
-            <w:tcBorders>
-              <w:top w:val="nil" w:sz="0" w:color="666666"/>
-              <w:bottom w:val="nil" w:sz="0" w:color="666666"/>
-              <w:start w:val="nil" w:sz="0" w:color="666666"/>
-              <w:end w:val="nil" w:sz="0" w:color="666666"/>
-            </w:tcBorders>
-          </w:tcPr>
-          <w:p>
-            <w:pPr>
-              <w:spacing w:before="0" w:after="60"/>
-              <w:jc w:val="end"/>
-            </w:pPr>
-            <w:r>
-              <w:rPr>
-                <w:rFonts w:ascii="Arial" w:hAnsi="Arial"/>
-                <w:sz w:val="20"/>
-              </w:rPr>
-              <w:t xml:space="default">63/80 (79%; 70–87)</w:t>
-            </w:r>
-          </w:p>
-        </w:tc>
-      </w:tr>
-      <w:tr>
-        <w:trPr>
-          <w:cantSplit/>
-        </w:trPr>
-        <w:tc>
-          <w:tcPr>
-            <w:tcW w:type="dxa" w:w="3354"/>
-            <w:tcMar>
-              <w:top w:type="dxa" w:w="35"/>
-              <w:bottom w:type="dxa" w:w="35"/>
-              <w:start w:type="dxa" w:w="70"/>
-              <w:end w:type="dxa" w:w="70"/>
-            </w:tcMar>
-            <w:tcBorders>
-              <w:top w:val="nil" w:sz="0" w:color="666666"/>
-              <w:bottom w:val="nil" w:sz="0" w:color="666666"/>
-              <w:start w:val="nil" w:sz="0" w:color="666666"/>
-              <w:end w:val="nil" w:sz="0" w:color="666666"/>
-            </w:tcBorders>
-          </w:tcPr>
-          <w:p>
-            <w:pPr>
-              <w:spacing w:before="0" w:after="60"/>
-              <w:jc w:val="start"/>
-            </w:pPr>
-            <w:r>
-              <w:rPr>
-                <w:rFonts w:ascii="Arial" w:hAnsi="Arial"/>
-                <w:sz w:val="20"/>
-              </w:rPr>
-              <w:t xml:space="default">Human Review 2</w:t>
-            </w:r>
-          </w:p>
-        </w:tc>
-        <w:tc>
-          <w:tcPr>
-            <w:tcW w:type="dxa" w:w="6510"/>
-            <w:tcMar>
-              <w:top w:type="dxa" w:w="35"/>
-              <w:bottom w:type="dxa" w:w="35"/>
-              <w:start w:type="dxa" w:w="70"/>
-              <w:end w:type="dxa" w:w="70"/>
-            </w:tcMar>
-            <w:tcBorders>
-              <w:top w:val="nil" w:sz="0" w:color="666666"/>
-              <w:bottom w:val="nil" w:sz="0" w:color="666666"/>
-              <w:start w:val="nil" w:sz="0" w:color="666666"/>
-              <w:end w:val="nil" w:sz="0" w:color="666666"/>
-            </w:tcBorders>
-          </w:tcPr>
-          <w:p>
-            <w:pPr>
-              <w:spacing w:before="0" w:after="60"/>
-              <w:jc w:val="end"/>
-            </w:pPr>
-            <w:r>
-              <w:rPr>
-                <w:rFonts w:ascii="Arial" w:hAnsi="Arial"/>
-                <w:sz w:val="20"/>
-              </w:rPr>
-              <w:t xml:space="default">61/80 (76%; 68–85)</w:t>
-            </w:r>
-          </w:p>
-        </w:tc>
-      </w:tr>
-      <w:tr>
-        <w:trPr>
-          <w:cantSplit/>
-        </w:trPr>
-        <w:tc>
-          <w:tcPr>
-            <w:tcW w:type="dxa" w:w="3354"/>
-            <w:tcMar>
-              <w:top w:type="dxa" w:w="35"/>
-              <w:bottom w:type="dxa" w:w="35"/>
-              <w:start w:type="dxa" w:w="70"/>
-              <w:end w:type="dxa" w:w="70"/>
-            </w:tcMar>
-            <w:tcBorders>
-              <w:top w:val="nil" w:sz="0" w:color="666666"/>
-              <w:bottom w:val="nil" w:sz="0" w:color="666666"/>
-              <w:start w:val="nil" w:sz="0" w:color="666666"/>
-              <w:end w:val="nil" w:sz="0" w:color="666666"/>
-            </w:tcBorders>
-          </w:tcPr>
-          <w:p>
-            <w:pPr>
-              <w:spacing w:before="0" w:after="60"/>
-              <w:jc w:val="start"/>
-            </w:pPr>
-            <w:r>
-              <w:rPr>
-                <w:rFonts w:ascii="Arial" w:hAnsi="Arial"/>
-                <w:sz w:val="20"/>
-              </w:rPr>
-              <w:t xml:space="default">All splits counted against ARBITER</w:t>
-            </w:r>
-          </w:p>
-        </w:tc>
-        <w:tc>
-          <w:tcPr>
-            <w:tcW w:type="dxa" w:w="6510"/>
-            <w:tcMar>
-              <w:top w:type="dxa" w:w="35"/>
-              <w:bottom w:type="dxa" w:w="35"/>
-              <w:start w:type="dxa" w:w="70"/>
-              <w:end w:type="dxa" w:w="70"/>
-            </w:tcMar>
-            <w:tcBorders>
-              <w:top w:val="nil" w:sz="0" w:color="666666"/>
-              <w:bottom w:val="nil" w:sz="0" w:color="666666"/>
-              <w:start w:val="nil" w:sz="0" w:color="666666"/>
-              <w:end w:val="nil" w:sz="0" w:color="666666"/>
-            </w:tcBorders>
-          </w:tcPr>
-          <w:p>
-            <w:pPr>
-              <w:spacing w:before="0" w:after="60"/>
-              <w:jc w:val="end"/>
-            </w:pPr>
-            <w:r>
-              <w:rPr>
-                <w:rFonts w:ascii="Arial" w:hAnsi="Arial"/>
-                <w:sz w:val="20"/>
-              </w:rPr>
-              <w:t xml:space="default">53/80 (66%; 58–75)</w:t>
-            </w:r>
-          </w:p>
-        </w:tc>
-      </w:tr>
-      <w:tr>
-        <w:trPr>
-          <w:cantSplit/>
-        </w:trPr>
-        <w:tc>
-          <w:tcPr>
-            <w:gridSpan w:val="2"/>
-            <w:tcW w:type="dxa" w:w="9864"/>
-            <w:tcMar>
-              <w:top w:type="dxa" w:w="35"/>
-              <w:bottom w:type="dxa" w:w="35"/>
-              <w:start w:type="dxa" w:w="70"/>
-              <w:end w:type="dxa" w:w="70"/>
-            </w:tcMar>
-            <w:tcBorders>
-              <w:top w:val="nil" w:sz="0" w:color="666666"/>
-              <w:bottom w:val="nil" w:sz="0" w:color="666666"/>
-              <w:start w:val="nil" w:sz="0" w:color="666666"/>
-              <w:end w:val="nil" w:sz="0" w:color="666666"/>
-            </w:tcBorders>
-          </w:tcPr>
-          <w:p>
-            <w:pPr>
-              <w:spacing w:before="0" w:after="60"/>
-            </w:pPr>
-            <w:r>
-              <w:rPr>
-                <w:rFonts w:ascii="Arial" w:hAnsi="Arial"/>
-                <w:sz w:val="20"/>
-              </w:rPr>
-              <w:t xml:space="default">Conditional blinded-label choice evaluation includes 80 arm-cells where the two arms disagreed and the 60 for which the human reviewers made an agreed choice; 20 choices split. Review-specific sensitivities use all 80. The final row counts all 20 splits against ARBITER by assumption, without assigning Unassisted wins. Human Review 1 chose neither arm in 4/80 cells; this is distinct from the split-loss assumption. CI, 95% confidence interval; 10,000 percentile bootstrap replicates, trials resampled within meta-analysis; seed 20261018.</w:t>
-            </w:r>
-          </w:p>
-        </w:tc>
-      </w:tr>
-    </w:tbl>
-    <w:p>
-      <w:pPr>
-        <w:pStyle w:val="BodyText"/>
-      </w:pPr>
-      <w:hyperlink r:id="rId37">
-        <w:r>
-          <w:rPr>
-            <w:rStyle w:val="Hyperlink"/>
-          </w:rPr>
-          <w:t xml:space="preserve">Download editable Word table</w:t>
-        </w:r>
-      </w:hyperlink>
-    </w:p>
-    <w:bookmarkEnd w:id="38"/>
-    <w:bookmarkStart w:id="40" w:name="table-3"/>
+    <w:bookmarkStart w:id="38" w:name="table-3"/>
     <w:p>
       <w:pPr>
         <w:pStyle w:val="Heading2"/>
@@ -1723,14 +1442,14 @@
         </w:tblCellMar>
         <w:tblLook w:firstRow="0" w:lastRow="0" w:firstColumn="0" w:lastColumn="0" w:noHBand="0" w:noVBand="0"/>
         <w:jc w:val="center"/>
-        <w:tblW w:type="dxa" w:w="9864"/>
+        <w:tblW w:type="dxa" w:w="9865"/>
         <w:tblLayout w:type="fixed"/>
       </w:tblPr>
       <w:tblGrid>
-        <w:gridCol w:w="3794"/>
-        <w:gridCol w:w="1518"/>
-        <w:gridCol w:w="2181"/>
-        <w:gridCol w:w="2371"/>
+        <w:gridCol w:w="3747"/>
+        <w:gridCol w:w="1606"/>
+        <w:gridCol w:w="2122"/>
+        <w:gridCol w:w="2390"/>
       </w:tblGrid>
       <w:tr>
         <w:trPr>
@@ -1739,7 +1458,7 @@
         </w:trPr>
         <w:tc>
           <w:tcPr>
-            <w:tcW w:type="dxa" w:w="3794"/>
+            <w:tcW w:type="dxa" w:w="3747"/>
             <w:tcMar>
               <w:top w:type="dxa" w:w="35"/>
               <w:bottom w:type="dxa" w:w="35"/>
@@ -1770,7 +1489,7 @@
         </w:tc>
         <w:tc>
           <w:tcPr>
-            <w:tcW w:type="dxa" w:w="1518"/>
+            <w:tcW w:type="dxa" w:w="1606"/>
             <w:tcMar>
               <w:top w:type="dxa" w:w="35"/>
               <w:bottom w:type="dxa" w:w="35"/>
@@ -1801,7 +1520,7 @@
         </w:tc>
         <w:tc>
           <w:tcPr>
-            <w:tcW w:type="dxa" w:w="2181"/>
+            <w:tcW w:type="dxa" w:w="2122"/>
             <w:tcMar>
               <w:top w:type="dxa" w:w="35"/>
               <w:bottom w:type="dxa" w:w="35"/>
@@ -1826,13 +1545,13 @@
                 <w:sz w:val="20"/>
                 <w:b/>
               </w:rPr>
-              <w:t xml:space="default">Unassisted</w:t>
-            </w:r>
-          </w:p>
-        </w:tc>
-        <w:tc>
-          <w:tcPr>
-            <w:tcW w:type="dxa" w:w="2371"/>
+              <w:t xml:space="default">Direct prompting</w:t>
+            </w:r>
+          </w:p>
+        </w:tc>
+        <w:tc>
+          <w:tcPr>
+            <w:tcW w:type="dxa" w:w="2390"/>
             <w:tcMar>
               <w:top w:type="dxa" w:w="35"/>
               <w:bottom w:type="dxa" w:w="35"/>
@@ -1869,7 +1588,7 @@
         <w:tc>
           <w:tcPr>
             <w:gridSpan w:val="4"/>
-            <w:tcW w:type="dxa" w:w="9864"/>
+            <w:tcW w:type="dxa" w:w="9865"/>
             <w:tcMar>
               <w:top w:type="dxa" w:w="35"/>
               <w:bottom w:type="dxa" w:w="35"/>
@@ -1905,7 +1624,7 @@
         </w:trPr>
         <w:tc>
           <w:tcPr>
-            <w:tcW w:type="dxa" w:w="3794"/>
+            <w:tcW w:type="dxa" w:w="3747"/>
             <w:tcMar>
               <w:top w:type="dxa" w:w="35"/>
               <w:bottom w:type="dxa" w:w="35"/>
@@ -1935,7 +1654,7 @@
         </w:tc>
         <w:tc>
           <w:tcPr>
-            <w:tcW w:type="dxa" w:w="1518"/>
+            <w:tcW w:type="dxa" w:w="1606"/>
             <w:tcMar>
               <w:top w:type="dxa" w:w="35"/>
               <w:bottom w:type="dxa" w:w="35"/>
@@ -1965,7 +1684,7 @@
         </w:tc>
         <w:tc>
           <w:tcPr>
-            <w:tcW w:type="dxa" w:w="2181"/>
+            <w:tcW w:type="dxa" w:w="2122"/>
             <w:tcMar>
               <w:top w:type="dxa" w:w="35"/>
               <w:bottom w:type="dxa" w:w="35"/>
@@ -1995,7 +1714,7 @@
         </w:tc>
         <w:tc>
           <w:tcPr>
-            <w:tcW w:type="dxa" w:w="2371"/>
+            <w:tcW w:type="dxa" w:w="2390"/>
             <w:tcMar>
               <w:top w:type="dxa" w:w="35"/>
               <w:bottom w:type="dxa" w:w="35"/>
@@ -2030,7 +1749,7 @@
         </w:trPr>
         <w:tc>
           <w:tcPr>
-            <w:tcW w:type="dxa" w:w="3794"/>
+            <w:tcW w:type="dxa" w:w="3747"/>
             <w:tcMar>
               <w:top w:type="dxa" w:w="35"/>
               <w:bottom w:type="dxa" w:w="35"/>
@@ -2060,7 +1779,7 @@
         </w:tc>
         <w:tc>
           <w:tcPr>
-            <w:tcW w:type="dxa" w:w="1518"/>
+            <w:tcW w:type="dxa" w:w="1606"/>
             <w:tcMar>
               <w:top w:type="dxa" w:w="35"/>
               <w:bottom w:type="dxa" w:w="35"/>
@@ -2090,7 +1809,7 @@
         </w:tc>
         <w:tc>
           <w:tcPr>
-            <w:tcW w:type="dxa" w:w="2181"/>
+            <w:tcW w:type="dxa" w:w="2122"/>
             <w:tcMar>
               <w:top w:type="dxa" w:w="35"/>
               <w:bottom w:type="dxa" w:w="35"/>
@@ -2120,7 +1839,7 @@
         </w:tc>
         <w:tc>
           <w:tcPr>
-            <w:tcW w:type="dxa" w:w="2371"/>
+            <w:tcW w:type="dxa" w:w="2390"/>
             <w:tcMar>
               <w:top w:type="dxa" w:w="35"/>
               <w:bottom w:type="dxa" w:w="35"/>
@@ -2155,7 +1874,7 @@
         </w:trPr>
         <w:tc>
           <w:tcPr>
-            <w:tcW w:type="dxa" w:w="3794"/>
+            <w:tcW w:type="dxa" w:w="3747"/>
             <w:tcMar>
               <w:top w:type="dxa" w:w="35"/>
               <w:bottom w:type="dxa" w:w="35"/>
@@ -2185,7 +1904,7 @@
         </w:tc>
         <w:tc>
           <w:tcPr>
-            <w:tcW w:type="dxa" w:w="1518"/>
+            <w:tcW w:type="dxa" w:w="1606"/>
             <w:tcMar>
               <w:top w:type="dxa" w:w="35"/>
               <w:bottom w:type="dxa" w:w="35"/>
@@ -2215,7 +1934,7 @@
         </w:tc>
         <w:tc>
           <w:tcPr>
-            <w:tcW w:type="dxa" w:w="2181"/>
+            <w:tcW w:type="dxa" w:w="2122"/>
             <w:tcMar>
               <w:top w:type="dxa" w:w="35"/>
               <w:bottom w:type="dxa" w:w="35"/>
@@ -2245,7 +1964,7 @@
         </w:tc>
         <w:tc>
           <w:tcPr>
-            <w:tcW w:type="dxa" w:w="2371"/>
+            <w:tcW w:type="dxa" w:w="2390"/>
             <w:tcMar>
               <w:top w:type="dxa" w:w="35"/>
               <w:bottom w:type="dxa" w:w="35"/>
@@ -2280,7 +1999,7 @@
         </w:trPr>
         <w:tc>
           <w:tcPr>
-            <w:tcW w:type="dxa" w:w="3794"/>
+            <w:tcW w:type="dxa" w:w="3747"/>
             <w:tcMar>
               <w:top w:type="dxa" w:w="35"/>
               <w:bottom w:type="dxa" w:w="35"/>
@@ -2310,7 +2029,7 @@
         </w:tc>
         <w:tc>
           <w:tcPr>
-            <w:tcW w:type="dxa" w:w="1518"/>
+            <w:tcW w:type="dxa" w:w="1606"/>
             <w:tcMar>
               <w:top w:type="dxa" w:w="35"/>
               <w:bottom w:type="dxa" w:w="35"/>
@@ -2340,7 +2059,7 @@
         </w:tc>
         <w:tc>
           <w:tcPr>
-            <w:tcW w:type="dxa" w:w="2181"/>
+            <w:tcW w:type="dxa" w:w="2122"/>
             <w:tcMar>
               <w:top w:type="dxa" w:w="35"/>
               <w:bottom w:type="dxa" w:w="35"/>
@@ -2370,7 +2089,7 @@
         </w:tc>
         <w:tc>
           <w:tcPr>
-            <w:tcW w:type="dxa" w:w="2371"/>
+            <w:tcW w:type="dxa" w:w="2390"/>
             <w:tcMar>
               <w:top w:type="dxa" w:w="35"/>
               <w:bottom w:type="dxa" w:w="35"/>
@@ -2406,7 +2125,7 @@
         <w:tc>
           <w:tcPr>
             <w:gridSpan w:val="4"/>
-            <w:tcW w:type="dxa" w:w="9864"/>
+            <w:tcW w:type="dxa" w:w="9865"/>
             <w:tcMar>
               <w:top w:type="dxa" w:w="35"/>
               <w:bottom w:type="dxa" w:w="35"/>
@@ -2442,7 +2161,7 @@
         </w:trPr>
         <w:tc>
           <w:tcPr>
-            <w:tcW w:type="dxa" w:w="3794"/>
+            <w:tcW w:type="dxa" w:w="3747"/>
             <w:tcMar>
               <w:top w:type="dxa" w:w="35"/>
               <w:bottom w:type="dxa" w:w="35"/>
@@ -2472,7 +2191,7 @@
         </w:tc>
         <w:tc>
           <w:tcPr>
-            <w:tcW w:type="dxa" w:w="1518"/>
+            <w:tcW w:type="dxa" w:w="1606"/>
             <w:tcMar>
               <w:top w:type="dxa" w:w="35"/>
               <w:bottom w:type="dxa" w:w="35"/>
@@ -2502,7 +2221,7 @@
         </w:tc>
         <w:tc>
           <w:tcPr>
-            <w:tcW w:type="dxa" w:w="2181"/>
+            <w:tcW w:type="dxa" w:w="2122"/>
             <w:tcMar>
               <w:top w:type="dxa" w:w="35"/>
               <w:bottom w:type="dxa" w:w="35"/>
@@ -2532,7 +2251,7 @@
         </w:tc>
         <w:tc>
           <w:tcPr>
-            <w:tcW w:type="dxa" w:w="2371"/>
+            <w:tcW w:type="dxa" w:w="2390"/>
             <w:tcMar>
               <w:top w:type="dxa" w:w="35"/>
               <w:bottom w:type="dxa" w:w="35"/>
@@ -2567,7 +2286,7 @@
         </w:trPr>
         <w:tc>
           <w:tcPr>
-            <w:tcW w:type="dxa" w:w="3794"/>
+            <w:tcW w:type="dxa" w:w="3747"/>
             <w:tcMar>
               <w:top w:type="dxa" w:w="35"/>
               <w:bottom w:type="dxa" w:w="35"/>
@@ -2597,7 +2316,7 @@
         </w:tc>
         <w:tc>
           <w:tcPr>
-            <w:tcW w:type="dxa" w:w="1518"/>
+            <w:tcW w:type="dxa" w:w="1606"/>
             <w:tcMar>
               <w:top w:type="dxa" w:w="35"/>
               <w:bottom w:type="dxa" w:w="35"/>
@@ -2627,7 +2346,7 @@
         </w:tc>
         <w:tc>
           <w:tcPr>
-            <w:tcW w:type="dxa" w:w="2181"/>
+            <w:tcW w:type="dxa" w:w="2122"/>
             <w:tcMar>
               <w:top w:type="dxa" w:w="35"/>
               <w:bottom w:type="dxa" w:w="35"/>
@@ -2657,7 +2376,7 @@
         </w:tc>
         <w:tc>
           <w:tcPr>
-            <w:tcW w:type="dxa" w:w="2371"/>
+            <w:tcW w:type="dxa" w:w="2390"/>
             <w:tcMar>
               <w:top w:type="dxa" w:w="35"/>
               <w:bottom w:type="dxa" w:w="35"/>
@@ -2693,6 +2412,954 @@
         <w:tc>
           <w:tcPr>
             <w:gridSpan w:val="4"/>
+            <w:tcW w:type="dxa" w:w="9865"/>
+            <w:tcMar>
+              <w:top w:type="dxa" w:w="35"/>
+              <w:bottom w:type="dxa" w:w="35"/>
+              <w:start w:type="dxa" w:w="70"/>
+              <w:end w:type="dxa" w:w="70"/>
+            </w:tcMar>
+            <w:tcBorders>
+              <w:top w:val="single" w:sz="6" w:color="666666"/>
+              <w:bottom w:val="nil" w:sz="0" w:color="666666"/>
+              <w:start w:val="nil" w:sz="0" w:color="666666"/>
+              <w:end w:val="nil" w:sz="0" w:color="666666"/>
+            </w:tcBorders>
+            <w:shd w:fill="F4F4F4"/>
+          </w:tcPr>
+          <w:p>
+            <w:pPr>
+              <w:spacing w:before="0" w:after="60"/>
+            </w:pPr>
+            <w:r>
+              <w:rPr>
+                <w:rFonts w:ascii="Arial" w:hAnsi="Arial"/>
+                <w:sz w:val="20"/>
+                <w:b/>
+              </w:rPr>
+              <w:t xml:space="default">C. Evidence records (ARBITER only)</w:t>
+            </w:r>
+          </w:p>
+        </w:tc>
+      </w:tr>
+      <w:tr>
+        <w:trPr>
+          <w:cantSplit/>
+        </w:trPr>
+        <w:tc>
+          <w:tcPr>
+            <w:tcW w:type="dxa" w:w="3747"/>
+            <w:tcMar>
+              <w:top w:type="dxa" w:w="35"/>
+              <w:bottom w:type="dxa" w:w="35"/>
+              <w:start w:type="dxa" w:w="70"/>
+              <w:end w:type="dxa" w:w="70"/>
+            </w:tcMar>
+            <w:tcBorders>
+              <w:top w:val="nil" w:sz="0" w:color="666666"/>
+              <w:bottom w:val="nil" w:sz="0" w:color="666666"/>
+              <w:start w:val="nil" w:sz="0" w:color="666666"/>
+              <w:end w:val="nil" w:sz="0" w:color="666666"/>
+            </w:tcBorders>
+          </w:tcPr>
+          <w:p>
+            <w:pPr>
+              <w:spacing w:before="0" w:after="60"/>
+              <w:jc w:val="start"/>
+            </w:pPr>
+            <w:r>
+              <w:rPr>
+                <w:rFonts w:ascii="Arial" w:hAnsi="Arial"/>
+                <w:sz w:val="20"/>
+              </w:rPr>
+              <w:t xml:space="default">Active required answers citing evidence</w:t>
+            </w:r>
+          </w:p>
+        </w:tc>
+        <w:tc>
+          <w:tcPr>
+            <w:tcW w:type="dxa" w:w="1606"/>
+            <w:tcMar>
+              <w:top w:type="dxa" w:w="35"/>
+              <w:bottom w:type="dxa" w:w="35"/>
+              <w:start w:type="dxa" w:w="70"/>
+              <w:end w:type="dxa" w:w="70"/>
+            </w:tcMar>
+            <w:tcBorders>
+              <w:top w:val="nil" w:sz="0" w:color="666666"/>
+              <w:bottom w:val="nil" w:sz="0" w:color="666666"/>
+              <w:start w:val="nil" w:sz="0" w:color="666666"/>
+              <w:end w:val="nil" w:sz="0" w:color="666666"/>
+            </w:tcBorders>
+          </w:tcPr>
+          <w:p>
+            <w:pPr>
+              <w:spacing w:before="0" w:after="60"/>
+              <w:jc w:val="end"/>
+            </w:pPr>
+            <w:r>
+              <w:rPr>
+                <w:rFonts w:ascii="Arial" w:hAnsi="Arial"/>
+                <w:sz w:val="20"/>
+              </w:rPr>
+              <w:t xml:space="default">1,538/1,538 (100.0%)</w:t>
+            </w:r>
+          </w:p>
+        </w:tc>
+        <w:tc>
+          <w:tcPr>
+            <w:tcW w:type="dxa" w:w="2122"/>
+            <w:tcMar>
+              <w:top w:type="dxa" w:w="35"/>
+              <w:bottom w:type="dxa" w:w="35"/>
+              <w:start w:type="dxa" w:w="70"/>
+              <w:end w:type="dxa" w:w="70"/>
+            </w:tcMar>
+            <w:tcBorders>
+              <w:top w:val="nil" w:sz="0" w:color="666666"/>
+              <w:bottom w:val="nil" w:sz="0" w:color="666666"/>
+              <w:start w:val="nil" w:sz="0" w:color="666666"/>
+              <w:end w:val="nil" w:sz="0" w:color="666666"/>
+            </w:tcBorders>
+          </w:tcPr>
+          <w:p>
+            <w:pPr>
+              <w:spacing w:before="0" w:after="60"/>
+              <w:jc w:val="end"/>
+            </w:pPr>
+            <w:r>
+              <w:rPr>
+                <w:rFonts w:ascii="Arial" w:hAnsi="Arial"/>
+                <w:sz w:val="20"/>
+              </w:rPr>
+              <w:t xml:space="default">Not available</w:t>
+            </w:r>
+          </w:p>
+        </w:tc>
+        <w:tc>
+          <w:tcPr>
+            <w:tcW w:type="dxa" w:w="2390"/>
+            <w:tcMar>
+              <w:top w:type="dxa" w:w="35"/>
+              <w:bottom w:type="dxa" w:w="35"/>
+              <w:start w:type="dxa" w:w="70"/>
+              <w:end w:type="dxa" w:w="70"/>
+            </w:tcMar>
+            <w:tcBorders>
+              <w:top w:val="nil" w:sz="0" w:color="666666"/>
+              <w:bottom w:val="nil" w:sz="0" w:color="666666"/>
+              <w:start w:val="nil" w:sz="0" w:color="666666"/>
+              <w:end w:val="nil" w:sz="0" w:color="666666"/>
+            </w:tcBorders>
+          </w:tcPr>
+          <w:p>
+            <w:pPr>
+              <w:spacing w:before="0" w:after="60"/>
+              <w:jc w:val="end"/>
+            </w:pPr>
+            <w:r>
+              <w:rPr>
+                <w:rFonts w:ascii="Arial" w:hAnsi="Arial"/>
+                <w:sz w:val="20"/>
+              </w:rPr>
+              <w:t xml:space="default">—</w:t>
+            </w:r>
+          </w:p>
+        </w:tc>
+      </w:tr>
+      <w:tr>
+        <w:trPr>
+          <w:cantSplit/>
+        </w:trPr>
+        <w:tc>
+          <w:tcPr>
+            <w:tcW w:type="dxa" w:w="3747"/>
+            <w:tcMar>
+              <w:top w:type="dxa" w:w="35"/>
+              <w:bottom w:type="dxa" w:w="35"/>
+              <w:start w:type="dxa" w:w="70"/>
+              <w:end w:type="dxa" w:w="70"/>
+            </w:tcMar>
+            <w:tcBorders>
+              <w:top w:val="nil" w:sz="0" w:color="666666"/>
+              <w:bottom w:val="nil" w:sz="0" w:color="666666"/>
+              <w:start w:val="nil" w:sz="0" w:color="666666"/>
+              <w:end w:val="nil" w:sz="0" w:color="666666"/>
+            </w:tcBorders>
+          </w:tcPr>
+          <w:p>
+            <w:pPr>
+              <w:spacing w:before="0" w:after="60"/>
+              <w:jc w:val="start"/>
+            </w:pPr>
+            <w:r>
+              <w:rPr>
+                <w:rFonts w:ascii="Arial" w:hAnsi="Arial"/>
+                <w:sz w:val="20"/>
+              </w:rPr>
+              <w:t xml:space="default">Text spans with complete binding fields</w:t>
+            </w:r>
+          </w:p>
+        </w:tc>
+        <w:tc>
+          <w:tcPr>
+            <w:tcW w:type="dxa" w:w="1606"/>
+            <w:tcMar>
+              <w:top w:type="dxa" w:w="35"/>
+              <w:bottom w:type="dxa" w:w="35"/>
+              <w:start w:type="dxa" w:w="70"/>
+              <w:end w:type="dxa" w:w="70"/>
+            </w:tcMar>
+            <w:tcBorders>
+              <w:top w:val="nil" w:sz="0" w:color="666666"/>
+              <w:bottom w:val="nil" w:sz="0" w:color="666666"/>
+              <w:start w:val="nil" w:sz="0" w:color="666666"/>
+              <w:end w:val="nil" w:sz="0" w:color="666666"/>
+            </w:tcBorders>
+          </w:tcPr>
+          <w:p>
+            <w:pPr>
+              <w:spacing w:before="0" w:after="60"/>
+              <w:jc w:val="end"/>
+            </w:pPr>
+            <w:r>
+              <w:rPr>
+                <w:rFonts w:ascii="Arial" w:hAnsi="Arial"/>
+                <w:sz w:val="20"/>
+              </w:rPr>
+              <w:t xml:space="default">1,407/1,407 (100.0%)</w:t>
+            </w:r>
+          </w:p>
+        </w:tc>
+        <w:tc>
+          <w:tcPr>
+            <w:tcW w:type="dxa" w:w="2122"/>
+            <w:tcMar>
+              <w:top w:type="dxa" w:w="35"/>
+              <w:bottom w:type="dxa" w:w="35"/>
+              <w:start w:type="dxa" w:w="70"/>
+              <w:end w:type="dxa" w:w="70"/>
+            </w:tcMar>
+            <w:tcBorders>
+              <w:top w:val="nil" w:sz="0" w:color="666666"/>
+              <w:bottom w:val="nil" w:sz="0" w:color="666666"/>
+              <w:start w:val="nil" w:sz="0" w:color="666666"/>
+              <w:end w:val="nil" w:sz="0" w:color="666666"/>
+            </w:tcBorders>
+          </w:tcPr>
+          <w:p>
+            <w:pPr>
+              <w:spacing w:before="0" w:after="60"/>
+              <w:jc w:val="end"/>
+            </w:pPr>
+            <w:r>
+              <w:rPr>
+                <w:rFonts w:ascii="Arial" w:hAnsi="Arial"/>
+                <w:sz w:val="20"/>
+              </w:rPr>
+              <w:t xml:space="default">Not available</w:t>
+            </w:r>
+          </w:p>
+        </w:tc>
+        <w:tc>
+          <w:tcPr>
+            <w:tcW w:type="dxa" w:w="2390"/>
+            <w:tcMar>
+              <w:top w:type="dxa" w:w="35"/>
+              <w:bottom w:type="dxa" w:w="35"/>
+              <w:start w:type="dxa" w:w="70"/>
+              <w:end w:type="dxa" w:w="70"/>
+            </w:tcMar>
+            <w:tcBorders>
+              <w:top w:val="nil" w:sz="0" w:color="666666"/>
+              <w:bottom w:val="nil" w:sz="0" w:color="666666"/>
+              <w:start w:val="nil" w:sz="0" w:color="666666"/>
+              <w:end w:val="nil" w:sz="0" w:color="666666"/>
+            </w:tcBorders>
+          </w:tcPr>
+          <w:p>
+            <w:pPr>
+              <w:spacing w:before="0" w:after="60"/>
+              <w:jc w:val="end"/>
+            </w:pPr>
+            <w:r>
+              <w:rPr>
+                <w:rFonts w:ascii="Arial" w:hAnsi="Arial"/>
+                <w:sz w:val="20"/>
+              </w:rPr>
+              <w:t xml:space="default">—</w:t>
+            </w:r>
+          </w:p>
+        </w:tc>
+      </w:tr>
+      <w:tr>
+        <w:trPr>
+          <w:cantSplit/>
+        </w:trPr>
+        <w:tc>
+          <w:tcPr>
+            <w:tcW w:type="dxa" w:w="3747"/>
+            <w:tcMar>
+              <w:top w:type="dxa" w:w="35"/>
+              <w:bottom w:type="dxa" w:w="35"/>
+              <w:start w:type="dxa" w:w="70"/>
+              <w:end w:type="dxa" w:w="70"/>
+            </w:tcMar>
+            <w:tcBorders>
+              <w:top w:val="nil" w:sz="0" w:color="666666"/>
+              <w:bottom w:val="nil" w:sz="0" w:color="666666"/>
+              <w:start w:val="nil" w:sz="0" w:color="666666"/>
+              <w:end w:val="nil" w:sz="0" w:color="666666"/>
+            </w:tcBorders>
+          </w:tcPr>
+          <w:p>
+            <w:pPr>
+              <w:spacing w:before="0" w:after="60"/>
+              <w:jc w:val="start"/>
+            </w:pPr>
+            <w:r>
+              <w:rPr>
+                <w:rFonts w:ascii="Arial" w:hAnsi="Arial"/>
+                <w:sz w:val="20"/>
+              </w:rPr>
+              <w:t xml:space="default">Image records with complete fields</w:t>
+            </w:r>
+          </w:p>
+        </w:tc>
+        <w:tc>
+          <w:tcPr>
+            <w:tcW w:type="dxa" w:w="1606"/>
+            <w:tcMar>
+              <w:top w:type="dxa" w:w="35"/>
+              <w:bottom w:type="dxa" w:w="35"/>
+              <w:start w:type="dxa" w:w="70"/>
+              <w:end w:type="dxa" w:w="70"/>
+            </w:tcMar>
+            <w:tcBorders>
+              <w:top w:val="nil" w:sz="0" w:color="666666"/>
+              <w:bottom w:val="nil" w:sz="0" w:color="666666"/>
+              <w:start w:val="nil" w:sz="0" w:color="666666"/>
+              <w:end w:val="nil" w:sz="0" w:color="666666"/>
+            </w:tcBorders>
+          </w:tcPr>
+          <w:p>
+            <w:pPr>
+              <w:spacing w:before="0" w:after="60"/>
+              <w:jc w:val="end"/>
+            </w:pPr>
+            <w:r>
+              <w:rPr>
+                <w:rFonts w:ascii="Arial" w:hAnsi="Arial"/>
+                <w:sz w:val="20"/>
+              </w:rPr>
+              <w:t xml:space="default">14/14 (100%)</w:t>
+            </w:r>
+          </w:p>
+        </w:tc>
+        <w:tc>
+          <w:tcPr>
+            <w:tcW w:type="dxa" w:w="2122"/>
+            <w:tcMar>
+              <w:top w:type="dxa" w:w="35"/>
+              <w:bottom w:type="dxa" w:w="35"/>
+              <w:start w:type="dxa" w:w="70"/>
+              <w:end w:type="dxa" w:w="70"/>
+            </w:tcMar>
+            <w:tcBorders>
+              <w:top w:val="nil" w:sz="0" w:color="666666"/>
+              <w:bottom w:val="nil" w:sz="0" w:color="666666"/>
+              <w:start w:val="nil" w:sz="0" w:color="666666"/>
+              <w:end w:val="nil" w:sz="0" w:color="666666"/>
+            </w:tcBorders>
+          </w:tcPr>
+          <w:p>
+            <w:pPr>
+              <w:spacing w:before="0" w:after="60"/>
+              <w:jc w:val="end"/>
+            </w:pPr>
+            <w:r>
+              <w:rPr>
+                <w:rFonts w:ascii="Arial" w:hAnsi="Arial"/>
+                <w:sz w:val="20"/>
+              </w:rPr>
+              <w:t xml:space="default">Not available</w:t>
+            </w:r>
+          </w:p>
+        </w:tc>
+        <w:tc>
+          <w:tcPr>
+            <w:tcW w:type="dxa" w:w="2390"/>
+            <w:tcMar>
+              <w:top w:type="dxa" w:w="35"/>
+              <w:bottom w:type="dxa" w:w="35"/>
+              <w:start w:type="dxa" w:w="70"/>
+              <w:end w:type="dxa" w:w="70"/>
+            </w:tcMar>
+            <w:tcBorders>
+              <w:top w:val="nil" w:sz="0" w:color="666666"/>
+              <w:bottom w:val="nil" w:sz="0" w:color="666666"/>
+              <w:start w:val="nil" w:sz="0" w:color="666666"/>
+              <w:end w:val="nil" w:sz="0" w:color="666666"/>
+            </w:tcBorders>
+          </w:tcPr>
+          <w:p>
+            <w:pPr>
+              <w:spacing w:before="0" w:after="60"/>
+              <w:jc w:val="end"/>
+            </w:pPr>
+            <w:r>
+              <w:rPr>
+                <w:rFonts w:ascii="Arial" w:hAnsi="Arial"/>
+                <w:sz w:val="20"/>
+              </w:rPr>
+              <w:t xml:space="default">—</w:t>
+            </w:r>
+          </w:p>
+        </w:tc>
+      </w:tr>
+      <w:tr>
+        <w:trPr>
+          <w:cantSplit/>
+        </w:trPr>
+        <w:tc>
+          <w:tcPr>
+            <w:tcW w:type="dxa" w:w="3747"/>
+            <w:tcMar>
+              <w:top w:type="dxa" w:w="35"/>
+              <w:bottom w:type="dxa" w:w="35"/>
+              <w:start w:type="dxa" w:w="70"/>
+              <w:end w:type="dxa" w:w="70"/>
+            </w:tcMar>
+            <w:tcBorders>
+              <w:top w:val="nil" w:sz="0" w:color="666666"/>
+              <w:bottom w:val="nil" w:sz="0" w:color="666666"/>
+              <w:start w:val="nil" w:sz="0" w:color="666666"/>
+              <w:end w:val="nil" w:sz="0" w:color="666666"/>
+            </w:tcBorders>
+          </w:tcPr>
+          <w:p>
+            <w:pPr>
+              <w:spacing w:before="0" w:after="60"/>
+              <w:jc w:val="start"/>
+            </w:pPr>
+            <w:r>
+              <w:rPr>
+                <w:rFonts w:ascii="Arial" w:hAnsi="Arial"/>
+                <w:sz w:val="20"/>
+              </w:rPr>
+              <w:t xml:space="default">Exported records passing verification</w:t>
+            </w:r>
+          </w:p>
+        </w:tc>
+        <w:tc>
+          <w:tcPr>
+            <w:tcW w:type="dxa" w:w="1606"/>
+            <w:tcMar>
+              <w:top w:type="dxa" w:w="35"/>
+              <w:bottom w:type="dxa" w:w="35"/>
+              <w:start w:type="dxa" w:w="70"/>
+              <w:end w:type="dxa" w:w="70"/>
+            </w:tcMar>
+            <w:tcBorders>
+              <w:top w:val="nil" w:sz="0" w:color="666666"/>
+              <w:bottom w:val="nil" w:sz="0" w:color="666666"/>
+              <w:start w:val="nil" w:sz="0" w:color="666666"/>
+              <w:end w:val="nil" w:sz="0" w:color="666666"/>
+            </w:tcBorders>
+          </w:tcPr>
+          <w:p>
+            <w:pPr>
+              <w:spacing w:before="0" w:after="60"/>
+              <w:jc w:val="end"/>
+            </w:pPr>
+            <w:r>
+              <w:rPr>
+                <w:rFonts w:ascii="Arial" w:hAnsi="Arial"/>
+                <w:sz w:val="20"/>
+              </w:rPr>
+              <w:t xml:space="default">102/102 (100.0%)</w:t>
+            </w:r>
+          </w:p>
+        </w:tc>
+        <w:tc>
+          <w:tcPr>
+            <w:tcW w:type="dxa" w:w="2122"/>
+            <w:tcMar>
+              <w:top w:type="dxa" w:w="35"/>
+              <w:bottom w:type="dxa" w:w="35"/>
+              <w:start w:type="dxa" w:w="70"/>
+              <w:end w:type="dxa" w:w="70"/>
+            </w:tcMar>
+            <w:tcBorders>
+              <w:top w:val="nil" w:sz="0" w:color="666666"/>
+              <w:bottom w:val="nil" w:sz="0" w:color="666666"/>
+              <w:start w:val="nil" w:sz="0" w:color="666666"/>
+              <w:end w:val="nil" w:sz="0" w:color="666666"/>
+            </w:tcBorders>
+          </w:tcPr>
+          <w:p>
+            <w:pPr>
+              <w:spacing w:before="0" w:after="60"/>
+              <w:jc w:val="end"/>
+            </w:pPr>
+            <w:r>
+              <w:rPr>
+                <w:rFonts w:ascii="Arial" w:hAnsi="Arial"/>
+                <w:sz w:val="20"/>
+              </w:rPr>
+              <w:t xml:space="default">Not available</w:t>
+            </w:r>
+          </w:p>
+        </w:tc>
+        <w:tc>
+          <w:tcPr>
+            <w:tcW w:type="dxa" w:w="2390"/>
+            <w:tcMar>
+              <w:top w:type="dxa" w:w="35"/>
+              <w:bottom w:type="dxa" w:w="35"/>
+              <w:start w:type="dxa" w:w="70"/>
+              <w:end w:type="dxa" w:w="70"/>
+            </w:tcMar>
+            <w:tcBorders>
+              <w:top w:val="nil" w:sz="0" w:color="666666"/>
+              <w:bottom w:val="nil" w:sz="0" w:color="666666"/>
+              <w:start w:val="nil" w:sz="0" w:color="666666"/>
+              <w:end w:val="nil" w:sz="0" w:color="666666"/>
+            </w:tcBorders>
+          </w:tcPr>
+          <w:p>
+            <w:pPr>
+              <w:spacing w:before="0" w:after="60"/>
+              <w:jc w:val="end"/>
+            </w:pPr>
+            <w:r>
+              <w:rPr>
+                <w:rFonts w:ascii="Arial" w:hAnsi="Arial"/>
+                <w:sz w:val="20"/>
+              </w:rPr>
+              <w:t xml:space="default">—</w:t>
+            </w:r>
+          </w:p>
+        </w:tc>
+      </w:tr>
+      <w:tr>
+        <w:trPr>
+          <w:cantSplit/>
+        </w:trPr>
+        <w:tc>
+          <w:tcPr>
+            <w:gridSpan w:val="4"/>
+            <w:tcW w:type="dxa" w:w="9865"/>
+            <w:tcMar>
+              <w:top w:type="dxa" w:w="35"/>
+              <w:bottom w:type="dxa" w:w="35"/>
+              <w:start w:type="dxa" w:w="70"/>
+              <w:end w:type="dxa" w:w="70"/>
+            </w:tcMar>
+            <w:tcBorders>
+              <w:top w:val="nil" w:sz="0" w:color="666666"/>
+              <w:bottom w:val="nil" w:sz="0" w:color="666666"/>
+              <w:start w:val="nil" w:sz="0" w:color="666666"/>
+              <w:end w:val="nil" w:sz="0" w:color="666666"/>
+            </w:tcBorders>
+          </w:tcPr>
+          <w:p>
+            <w:pPr>
+              <w:spacing w:before="0" w:after="60"/>
+            </w:pPr>
+            <w:r>
+              <w:rPr>
+                <w:rFonts w:ascii="Arial" w:hAnsi="Arial"/>
+                <w:sz w:val="20"/>
+              </w:rPr>
+              <w:t xml:space="default">Direct prompting rule-break cells show No./total (%; 95% CI); CI bounds are percentages. Domain rules use evaluable ratings (ARBITER 510; Direct prompting 509); one Direct prompting cell is unevaluable. ARBITER has no recorded domain overrides; one Overall escalation is permitted. Runtime and API list-price equivalents use 102 paired trials; source summaries are median (IQR), contrasts are paired mean differences. Cost is a frozen-rate equivalent, not expenditure. Evidence-record checks do not assess whether evidence supports an answer. — means not applicable; Not available means not measured. CI, 95% confidence interval; 10,000 percentile bootstrap replicates, trials resampled within meta-analysis; seed 20261018.</w:t>
+            </w:r>
+          </w:p>
+        </w:tc>
+      </w:tr>
+    </w:tbl>
+    <w:p>
+      <w:pPr>
+        <w:pStyle w:val="BodyText"/>
+      </w:pPr>
+      <w:hyperlink r:id="rId37">
+        <w:r>
+          <w:rPr>
+            <w:rStyle w:val="Hyperlink"/>
+          </w:rPr>
+          <w:t xml:space="preserve">Download editable Word table</w:t>
+        </w:r>
+      </w:hyperlink>
+    </w:p>
+    <w:bookmarkEnd w:id="38"/>
+    <w:bookmarkStart w:id="40" w:name="table-4"/>
+    <w:p>
+      <w:pPr>
+        <w:pStyle w:val="Heading2"/>
+        <w:pageBreakBefore/>
+      </w:pPr>
+      <w:r>
+        <w:t xml:space="preserve">Table</w:t>
+      </w:r>
+      <w:r>
+        <w:t xml:space="preserve"> </w:t>
+      </w:r>
+      <w:r>
+        <w:t xml:space="preserve">4. Conditional blinded-label choices and sensitivities</w:t>
+      </w:r>
+    </w:p>
+    <w:tbl>
+      <w:tblPr>
+        <w:tblCellMar>
+          <w:top w:w="0" w:type="dxa"/>
+          <w:bottom w:w="0" w:type="dxa"/>
+          <w:start w:w="60" w:type="dxa"/>
+          <w:end w:w="60" w:type="dxa"/>
+        </w:tblCellMar>
+        <w:tblLook w:firstRow="0" w:lastRow="0" w:firstColumn="0" w:lastColumn="0" w:noHBand="0" w:noVBand="0"/>
+        <w:jc w:val="center"/>
+        <w:tblW w:type="dxa" w:w="9864"/>
+        <w:tblLayout w:type="fixed"/>
+      </w:tblPr>
+      <w:tblGrid>
+        <w:gridCol w:w="3354"/>
+        <w:gridCol w:w="6510"/>
+      </w:tblGrid>
+      <w:tr>
+        <w:trPr>
+          <w:cantSplit/>
+          <w:tblHeader/>
+        </w:trPr>
+        <w:tc>
+          <w:tcPr>
+            <w:tcW w:type="dxa" w:w="3354"/>
+            <w:tcMar>
+              <w:top w:type="dxa" w:w="35"/>
+              <w:bottom w:type="dxa" w:w="35"/>
+              <w:start w:type="dxa" w:w="70"/>
+              <w:end w:type="dxa" w:w="70"/>
+            </w:tcMar>
+            <w:tcBorders>
+              <w:top w:val="single" w:sz="6" w:color="666666"/>
+              <w:bottom w:val="single" w:sz="6" w:color="666666"/>
+              <w:start w:val="nil" w:sz="0" w:color="666666"/>
+              <w:end w:val="nil" w:sz="0" w:color="666666"/>
+            </w:tcBorders>
+          </w:tcPr>
+          <w:p>
+            <w:pPr>
+              <w:spacing w:before="0" w:after="60"/>
+              <w:jc w:val="start"/>
+            </w:pPr>
+            <w:r>
+              <w:rPr>
+                <w:rFonts w:ascii="Arial" w:hAnsi="Arial"/>
+                <w:sz w:val="20"/>
+                <w:b/>
+              </w:rPr>
+              <w:t xml:space="default">Population</w:t>
+            </w:r>
+          </w:p>
+        </w:tc>
+        <w:tc>
+          <w:tcPr>
+            <w:tcW w:type="dxa" w:w="6510"/>
+            <w:tcMar>
+              <w:top w:type="dxa" w:w="35"/>
+              <w:bottom w:type="dxa" w:w="35"/>
+              <w:start w:type="dxa" w:w="70"/>
+              <w:end w:type="dxa" w:w="70"/>
+            </w:tcMar>
+            <w:tcBorders>
+              <w:top w:val="single" w:sz="6" w:color="666666"/>
+              <w:bottom w:val="single" w:sz="6" w:color="666666"/>
+              <w:start w:val="nil" w:sz="0" w:color="666666"/>
+              <w:end w:val="nil" w:sz="0" w:color="666666"/>
+            </w:tcBorders>
+          </w:tcPr>
+          <w:p>
+            <w:pPr>
+              <w:spacing w:before="0" w:after="60"/>
+              <w:jc w:val="end"/>
+            </w:pPr>
+            <w:r>
+              <w:rPr>
+                <w:rFonts w:ascii="Arial" w:hAnsi="Arial"/>
+                <w:sz w:val="20"/>
+                <w:b/>
+              </w:rPr>
+              <w:t xml:space="default">ARBITER, No./total (%) (95% CI)</w:t>
+            </w:r>
+          </w:p>
+        </w:tc>
+      </w:tr>
+      <w:tr>
+        <w:trPr>
+          <w:cantSplit/>
+        </w:trPr>
+        <w:tc>
+          <w:tcPr>
+            <w:tcW w:type="dxa" w:w="3354"/>
+            <w:tcMar>
+              <w:top w:type="dxa" w:w="35"/>
+              <w:bottom w:type="dxa" w:w="35"/>
+              <w:start w:type="dxa" w:w="70"/>
+              <w:end w:type="dxa" w:w="70"/>
+            </w:tcMar>
+            <w:tcBorders>
+              <w:top w:val="nil" w:sz="0" w:color="666666"/>
+              <w:bottom w:val="nil" w:sz="0" w:color="666666"/>
+              <w:start w:val="nil" w:sz="0" w:color="666666"/>
+              <w:end w:val="nil" w:sz="0" w:color="666666"/>
+            </w:tcBorders>
+          </w:tcPr>
+          <w:p>
+            <w:pPr>
+              <w:spacing w:before="0" w:after="60"/>
+              <w:jc w:val="start"/>
+            </w:pPr>
+            <w:r>
+              <w:rPr>
+                <w:rFonts w:ascii="Arial" w:hAnsi="Arial"/>
+                <w:sz w:val="20"/>
+              </w:rPr>
+              <w:t xml:space="default">Agreed choices</w:t>
+            </w:r>
+          </w:p>
+        </w:tc>
+        <w:tc>
+          <w:tcPr>
+            <w:tcW w:type="dxa" w:w="6510"/>
+            <w:tcMar>
+              <w:top w:type="dxa" w:w="35"/>
+              <w:bottom w:type="dxa" w:w="35"/>
+              <w:start w:type="dxa" w:w="70"/>
+              <w:end w:type="dxa" w:w="70"/>
+            </w:tcMar>
+            <w:tcBorders>
+              <w:top w:val="nil" w:sz="0" w:color="666666"/>
+              <w:bottom w:val="nil" w:sz="0" w:color="666666"/>
+              <w:start w:val="nil" w:sz="0" w:color="666666"/>
+              <w:end w:val="nil" w:sz="0" w:color="666666"/>
+            </w:tcBorders>
+          </w:tcPr>
+          <w:p>
+            <w:pPr>
+              <w:spacing w:before="0" w:after="60"/>
+              <w:jc w:val="end"/>
+            </w:pPr>
+            <w:r>
+              <w:rPr>
+                <w:rFonts w:ascii="Arial" w:hAnsi="Arial"/>
+                <w:sz w:val="20"/>
+              </w:rPr>
+              <w:t xml:space="default">53/60 (88%; 80–96)</w:t>
+            </w:r>
+          </w:p>
+        </w:tc>
+      </w:tr>
+      <w:tr>
+        <w:trPr>
+          <w:cantSplit/>
+        </w:trPr>
+        <w:tc>
+          <w:tcPr>
+            <w:tcW w:type="dxa" w:w="3354"/>
+            <w:tcMar>
+              <w:top w:type="dxa" w:w="35"/>
+              <w:bottom w:type="dxa" w:w="35"/>
+              <w:start w:type="dxa" w:w="70"/>
+              <w:end w:type="dxa" w:w="70"/>
+            </w:tcMar>
+            <w:tcBorders>
+              <w:top w:val="nil" w:sz="0" w:color="666666"/>
+              <w:bottom w:val="nil" w:sz="0" w:color="666666"/>
+              <w:start w:val="nil" w:sz="0" w:color="666666"/>
+              <w:end w:val="nil" w:sz="0" w:color="666666"/>
+            </w:tcBorders>
+          </w:tcPr>
+          <w:p>
+            <w:pPr>
+              <w:spacing w:before="0" w:after="60"/>
+              <w:jc w:val="start"/>
+            </w:pPr>
+            <w:r>
+              <w:rPr>
+                <w:rFonts w:ascii="Arial" w:hAnsi="Arial"/>
+                <w:sz w:val="20"/>
+              </w:rPr>
+              <w:t xml:space="default">Human Review 1</w:t>
+            </w:r>
+          </w:p>
+        </w:tc>
+        <w:tc>
+          <w:tcPr>
+            <w:tcW w:type="dxa" w:w="6510"/>
+            <w:tcMar>
+              <w:top w:type="dxa" w:w="35"/>
+              <w:bottom w:type="dxa" w:w="35"/>
+              <w:start w:type="dxa" w:w="70"/>
+              <w:end w:type="dxa" w:w="70"/>
+            </w:tcMar>
+            <w:tcBorders>
+              <w:top w:val="nil" w:sz="0" w:color="666666"/>
+              <w:bottom w:val="nil" w:sz="0" w:color="666666"/>
+              <w:start w:val="nil" w:sz="0" w:color="666666"/>
+              <w:end w:val="nil" w:sz="0" w:color="666666"/>
+            </w:tcBorders>
+          </w:tcPr>
+          <w:p>
+            <w:pPr>
+              <w:spacing w:before="0" w:after="60"/>
+              <w:jc w:val="end"/>
+            </w:pPr>
+            <w:r>
+              <w:rPr>
+                <w:rFonts w:ascii="Arial" w:hAnsi="Arial"/>
+                <w:sz w:val="20"/>
+              </w:rPr>
+              <w:t xml:space="default">63/80 (79%; 70–87)</w:t>
+            </w:r>
+          </w:p>
+        </w:tc>
+      </w:tr>
+      <w:tr>
+        <w:trPr>
+          <w:cantSplit/>
+        </w:trPr>
+        <w:tc>
+          <w:tcPr>
+            <w:tcW w:type="dxa" w:w="3354"/>
+            <w:tcMar>
+              <w:top w:type="dxa" w:w="35"/>
+              <w:bottom w:type="dxa" w:w="35"/>
+              <w:start w:type="dxa" w:w="70"/>
+              <w:end w:type="dxa" w:w="70"/>
+            </w:tcMar>
+            <w:tcBorders>
+              <w:top w:val="nil" w:sz="0" w:color="666666"/>
+              <w:bottom w:val="nil" w:sz="0" w:color="666666"/>
+              <w:start w:val="nil" w:sz="0" w:color="666666"/>
+              <w:end w:val="nil" w:sz="0" w:color="666666"/>
+            </w:tcBorders>
+          </w:tcPr>
+          <w:p>
+            <w:pPr>
+              <w:spacing w:before="0" w:after="60"/>
+              <w:jc w:val="start"/>
+            </w:pPr>
+            <w:r>
+              <w:rPr>
+                <w:rFonts w:ascii="Arial" w:hAnsi="Arial"/>
+                <w:sz w:val="20"/>
+              </w:rPr>
+              <w:t xml:space="default">Human Review 2</w:t>
+            </w:r>
+          </w:p>
+        </w:tc>
+        <w:tc>
+          <w:tcPr>
+            <w:tcW w:type="dxa" w:w="6510"/>
+            <w:tcMar>
+              <w:top w:type="dxa" w:w="35"/>
+              <w:bottom w:type="dxa" w:w="35"/>
+              <w:start w:type="dxa" w:w="70"/>
+              <w:end w:type="dxa" w:w="70"/>
+            </w:tcMar>
+            <w:tcBorders>
+              <w:top w:val="nil" w:sz="0" w:color="666666"/>
+              <w:bottom w:val="nil" w:sz="0" w:color="666666"/>
+              <w:start w:val="nil" w:sz="0" w:color="666666"/>
+              <w:end w:val="nil" w:sz="0" w:color="666666"/>
+            </w:tcBorders>
+          </w:tcPr>
+          <w:p>
+            <w:pPr>
+              <w:spacing w:before="0" w:after="60"/>
+              <w:jc w:val="end"/>
+            </w:pPr>
+            <w:r>
+              <w:rPr>
+                <w:rFonts w:ascii="Arial" w:hAnsi="Arial"/>
+                <w:sz w:val="20"/>
+              </w:rPr>
+              <w:t xml:space="default">61/80 (76%; 68–85)</w:t>
+            </w:r>
+          </w:p>
+        </w:tc>
+      </w:tr>
+      <w:tr>
+        <w:trPr>
+          <w:cantSplit/>
+        </w:trPr>
+        <w:tc>
+          <w:tcPr>
+            <w:tcW w:type="dxa" w:w="3354"/>
+            <w:tcMar>
+              <w:top w:type="dxa" w:w="35"/>
+              <w:bottom w:type="dxa" w:w="35"/>
+              <w:start w:type="dxa" w:w="70"/>
+              <w:end w:type="dxa" w:w="70"/>
+            </w:tcMar>
+            <w:tcBorders>
+              <w:top w:val="nil" w:sz="0" w:color="666666"/>
+              <w:bottom w:val="nil" w:sz="0" w:color="666666"/>
+              <w:start w:val="nil" w:sz="0" w:color="666666"/>
+              <w:end w:val="nil" w:sz="0" w:color="666666"/>
+            </w:tcBorders>
+          </w:tcPr>
+          <w:p>
+            <w:pPr>
+              <w:spacing w:before="0" w:after="60"/>
+              <w:jc w:val="start"/>
+            </w:pPr>
+            <w:r>
+              <w:rPr>
+                <w:rFonts w:ascii="Arial" w:hAnsi="Arial"/>
+                <w:sz w:val="20"/>
+              </w:rPr>
+              <w:t xml:space="default">All splits counted against ARBITER</w:t>
+            </w:r>
+          </w:p>
+        </w:tc>
+        <w:tc>
+          <w:tcPr>
+            <w:tcW w:type="dxa" w:w="6510"/>
+            <w:tcMar>
+              <w:top w:type="dxa" w:w="35"/>
+              <w:bottom w:type="dxa" w:w="35"/>
+              <w:start w:type="dxa" w:w="70"/>
+              <w:end w:type="dxa" w:w="70"/>
+            </w:tcMar>
+            <w:tcBorders>
+              <w:top w:val="nil" w:sz="0" w:color="666666"/>
+              <w:bottom w:val="nil" w:sz="0" w:color="666666"/>
+              <w:start w:val="nil" w:sz="0" w:color="666666"/>
+              <w:end w:val="nil" w:sz="0" w:color="666666"/>
+            </w:tcBorders>
+          </w:tcPr>
+          <w:p>
+            <w:pPr>
+              <w:spacing w:before="0" w:after="60"/>
+              <w:jc w:val="end"/>
+            </w:pPr>
+            <w:r>
+              <w:rPr>
+                <w:rFonts w:ascii="Arial" w:hAnsi="Arial"/>
+                <w:sz w:val="20"/>
+              </w:rPr>
+              <w:t xml:space="default">53/80 (66%; 58–75)</w:t>
+            </w:r>
+          </w:p>
+        </w:tc>
+      </w:tr>
+      <w:tr>
+        <w:trPr>
+          <w:cantSplit/>
+        </w:trPr>
+        <w:tc>
+          <w:tcPr>
+            <w:gridSpan w:val="2"/>
             <w:tcW w:type="dxa" w:w="9864"/>
             <w:tcMar>
               <w:top w:type="dxa" w:w="35"/>
@@ -2716,7 +3383,7 @@
                 <w:rFonts w:ascii="Arial" w:hAnsi="Arial"/>
                 <w:sz w:val="20"/>
               </w:rPr>
-              <w:t xml:space="default">Unassisted rule-break cells show No./total (%; 95% CI); CI bounds are percentages. Domain rules use evaluable ratings (ARBITER 510; Unassisted 509); one Unassisted cell is unevaluable. ARBITER has no recorded domain overrides; one Overall escalation is permitted. Runtime and API list-price equivalents use 102 paired trials; source summaries are median (IQR), contrasts are paired mean differences. Cost is a frozen-rate equivalent, not expenditure. — means not applicable; Not available means not measured. CI, 95% confidence interval; 10,000 percentile bootstrap replicates, trials resampled within meta-analysis; seed 20261018.</w:t>
+              <w:t xml:space="default">Conditional blinded-label choice evaluation includes 80 arm-cells where the two arms disagreed and the 60 for which the human reviewers made an agreed choice; 20 choices split. Review-specific sensitivities use all 80. The final row counts all 20 splits against ARBITER by assumption, without assigning Direct prompting wins. Human Review 1 chose neither arm in 4/80 cells; this is distinct from the split-loss assumption. CI, 95% confidence interval; 10,000 percentile bootstrap replicates, trials resampled within meta-analysis; seed 20261018.</w:t>
             </w:r>
           </w:p>
         </w:tc>

</xml_diff>

<commit_message>
Tighten Figure 2 legend padding
</commit_message>
<xml_diff>
--- a/output/manuscript/Main-analysis.docx
+++ b/output/manuscript/Main-analysis.docx
@@ -125,7 +125,7 @@
               <a:graphicData uri="http://schemas.openxmlformats.org/drawingml/2006/picture">
                 <pic:pic>
                   <pic:nvPicPr>
-                    <pic:cNvPr descr="C:\Users\ALI-SA~1\AppData\Local\Temp\arbiter-analysis-word-h2yl2cwo\Figure1.png" id="14" name="Picture"/>
+                    <pic:cNvPr descr="C:\Users\ALI-SA~1\AppData\Local\Temp\arbiter-analysis-word-u6b5quon\Figure1.png" id="14" name="Picture"/>
                     <pic:cNvPicPr>
                       <a:picLocks noChangeArrowheads="1" noChangeAspect="1"/>
                     </pic:cNvPicPr>
@@ -194,7 +194,7 @@
               <a:graphicData uri="http://schemas.openxmlformats.org/drawingml/2006/picture">
                 <pic:pic>
                   <pic:nvPicPr>
-                    <pic:cNvPr descr="C:\Users\ALI-SA~1\AppData\Local\Temp\arbiter-analysis-word-h2yl2cwo\Figure2.png" id="18" name="Picture"/>
+                    <pic:cNvPr descr="C:\Users\ALI-SA~1\AppData\Local\Temp\arbiter-analysis-word-u6b5quon\Figure2.png" id="18" name="Picture"/>
                     <pic:cNvPicPr>
                       <a:picLocks noChangeArrowheads="1" noChangeAspect="1"/>
                     </pic:cNvPicPr>
@@ -293,7 +293,7 @@
               <a:graphicData uri="http://schemas.openxmlformats.org/drawingml/2006/picture">
                 <pic:pic>
                   <pic:nvPicPr>
-                    <pic:cNvPr descr="C:\Users\ALI-SA~1\AppData\Local\Temp\arbiter-analysis-word-h2yl2cwo\Figure3.png" id="24" name="Picture"/>
+                    <pic:cNvPr descr="C:\Users\ALI-SA~1\AppData\Local\Temp\arbiter-analysis-word-u6b5quon\Figure3.png" id="24" name="Picture"/>
                     <pic:cNvPicPr>
                       <a:picLocks noChangeArrowheads="1" noChangeAspect="1"/>
                     </pic:cNvPicPr>
@@ -362,7 +362,7 @@
               <a:graphicData uri="http://schemas.openxmlformats.org/drawingml/2006/picture">
                 <pic:pic>
                   <pic:nvPicPr>
-                    <pic:cNvPr descr="C:\Users\ALI-SA~1\AppData\Local\Temp\arbiter-analysis-word-h2yl2cwo\Figure4.png" id="28" name="Picture"/>
+                    <pic:cNvPr descr="C:\Users\ALI-SA~1\AppData\Local\Temp\arbiter-analysis-word-u6b5quon\Figure4.png" id="28" name="Picture"/>
                     <pic:cNvPicPr>
                       <a:picLocks noChangeArrowheads="1" noChangeAspect="1"/>
                     </pic:cNvPicPr>
@@ -431,7 +431,7 @@
               <a:graphicData uri="http://schemas.openxmlformats.org/drawingml/2006/picture">
                 <pic:pic>
                   <pic:nvPicPr>
-                    <pic:cNvPr descr="C:\Users\ALI-SA~1\AppData\Local\Temp\arbiter-analysis-word-h2yl2cwo\Figure5.png" id="32" name="Picture"/>
+                    <pic:cNvPr descr="C:\Users\ALI-SA~1\AppData\Local\Temp\arbiter-analysis-word-u6b5quon\Figure5.png" id="32" name="Picture"/>
                     <pic:cNvPicPr>
                       <a:picLocks noChangeArrowheads="1" noChangeAspect="1"/>
                     </pic:cNvPicPr>

</xml_diff>

<commit_message>
Restore source meta-analyses as eTable 1 and renumber supplement
</commit_message>
<xml_diff>
--- a/output/manuscript/Main-analysis.docx
+++ b/output/manuscript/Main-analysis.docx
@@ -70,7 +70,7 @@
         <w:keepLines/>
       </w:pPr>
       <w:r>
-        <w:t xml:space="preserve">Figure 5 distinguishes five-level from collapsed signalling-answer agreement on paired eligible components. In D3 against Human Review 1, the five-level difference is −10.3 points (95% CI, −17.2 to −3.2), whereas the collapsed difference is +8.5 (3.5–13.7), both on 165 components. D5 collapsed gains are +11.3 points for Human Review 1 and +3.7 (−0.3 to 7.4) for Human Review 2. eTable 4 retains source-specific domain summaries, eligibility accounting and complete paired question contrasts for both codings, including sparse and unfavorable results.</w:t>
+        <w:t xml:space="preserve">Figure 5 distinguishes five-level from collapsed signalling-answer agreement on paired eligible components. In D3 against Human Review 1, the five-level difference is −10.3 points (95% CI, −17.2 to −3.2), whereas the collapsed difference is +8.5 (3.5–13.7), both on 165 components. D5 collapsed gains are +11.3 points for Human Review 1 and +3.7 (−0.3 to 7.4) for Human Review 2. eTable 5 retains source-specific domain summaries, eligibility accounting and complete paired question contrasts for both codings, including sparse and unfavorable results.</w:t>
       </w:r>
     </w:p>
     <w:p>
@@ -125,7 +125,7 @@
               <a:graphicData uri="http://schemas.openxmlformats.org/drawingml/2006/picture">
                 <pic:pic>
                   <pic:nvPicPr>
-                    <pic:cNvPr descr="C:\Users\ALI-SA~1\AppData\Local\Temp\arbiter-analysis-word-u6b5quon\Figure1.png" id="14" name="Picture"/>
+                    <pic:cNvPr descr="C:\Users\ALI-SA~1\AppData\Local\Temp\arbiter-analysis-word-b5fcm4bm\Figure1.png" id="14" name="Picture"/>
                     <pic:cNvPicPr>
                       <a:picLocks noChangeArrowheads="1" noChangeAspect="1"/>
                     </pic:cNvPicPr>
@@ -194,7 +194,7 @@
               <a:graphicData uri="http://schemas.openxmlformats.org/drawingml/2006/picture">
                 <pic:pic>
                   <pic:nvPicPr>
-                    <pic:cNvPr descr="C:\Users\ALI-SA~1\AppData\Local\Temp\arbiter-analysis-word-u6b5quon\Figure2.png" id="18" name="Picture"/>
+                    <pic:cNvPr descr="C:\Users\ALI-SA~1\AppData\Local\Temp\arbiter-analysis-word-b5fcm4bm\Figure2.png" id="18" name="Picture"/>
                     <pic:cNvPicPr>
                       <a:picLocks noChangeArrowheads="1" noChangeAspect="1"/>
                     </pic:cNvPicPr>
@@ -293,7 +293,7 @@
               <a:graphicData uri="http://schemas.openxmlformats.org/drawingml/2006/picture">
                 <pic:pic>
                   <pic:nvPicPr>
-                    <pic:cNvPr descr="C:\Users\ALI-SA~1\AppData\Local\Temp\arbiter-analysis-word-u6b5quon\Figure3.png" id="24" name="Picture"/>
+                    <pic:cNvPr descr="C:\Users\ALI-SA~1\AppData\Local\Temp\arbiter-analysis-word-b5fcm4bm\Figure3.png" id="24" name="Picture"/>
                     <pic:cNvPicPr>
                       <a:picLocks noChangeArrowheads="1" noChangeAspect="1"/>
                     </pic:cNvPicPr>
@@ -362,7 +362,7 @@
               <a:graphicData uri="http://schemas.openxmlformats.org/drawingml/2006/picture">
                 <pic:pic>
                   <pic:nvPicPr>
-                    <pic:cNvPr descr="C:\Users\ALI-SA~1\AppData\Local\Temp\arbiter-analysis-word-u6b5quon\Figure4.png" id="28" name="Picture"/>
+                    <pic:cNvPr descr="C:\Users\ALI-SA~1\AppData\Local\Temp\arbiter-analysis-word-b5fcm4bm\Figure4.png" id="28" name="Picture"/>
                     <pic:cNvPicPr>
                       <a:picLocks noChangeArrowheads="1" noChangeAspect="1"/>
                     </pic:cNvPicPr>
@@ -431,7 +431,7 @@
               <a:graphicData uri="http://schemas.openxmlformats.org/drawingml/2006/picture">
                 <pic:pic>
                   <pic:nvPicPr>
-                    <pic:cNvPr descr="C:\Users\ALI-SA~1\AppData\Local\Temp\arbiter-analysis-word-u6b5quon\Figure5.png" id="32" name="Picture"/>
+                    <pic:cNvPr descr="C:\Users\ALI-SA~1\AppData\Local\Temp\arbiter-analysis-word-b5fcm4bm\Figure5.png" id="32" name="Picture"/>
                     <pic:cNvPicPr>
                       <a:picLocks noChangeArrowheads="1" noChangeAspect="1"/>
                     </pic:cNvPicPr>
@@ -470,7 +470,7 @@
         <w:keepLines/>
       </w:pPr>
       <w:r>
-        <w:t xml:space="preserve">Figure 5. Paired signalling-answer diagnostics. Rows cover all five domains against each human reviewer; n is the number of question components evaluable in both arms. Diamonds and bars show ARBITER minus Direct prompting exact agreement and 95% intervals. Five-level matching distinguishes yes, probably yes, no, probably no and no information. Collapsed matching combines yes/probably yes and no/probably no, leaving no information separate. These are different estimands. D1: randomisation process; D2: deviations from intended interventions; D3: missing outcome data; D4: outcome measurement; D5: selection of the reported result. D3 and D5 illustrate reference dependence and the effect of coding. eTable 4 contains source-specific domain summaries, complete paired question contrasts and eligibility accounting for both codings. CI, 95% confidence interval; 10,000 percentile bootstrap replicates, trials resampled within meta-analysis; seed 20261018.</w:t>
+        <w:t xml:space="preserve">Figure 5. Paired signalling-answer diagnostics. Rows cover all five domains against each human reviewer; n is the number of question components evaluable in both arms. Diamonds and bars show ARBITER minus Direct prompting exact agreement and 95% intervals. Five-level matching distinguishes yes, probably yes, no, probably no and no information. Collapsed matching combines yes/probably yes and no/probably no, leaving no information separate. These are different estimands. D1: randomisation process; D2: deviations from intended interventions; D3: missing outcome data; D4: outcome measurement; D5: selection of the reported result. D3 and D5 illustrate reference dependence and the effect of coding. eTable 5 contains source-specific domain summaries, complete paired question contrasts and eligibility accounting for both codings. CI, 95% confidence interval; 10,000 percentile bootstrap replicates, trials resampled within meta-analysis; seed 20261018.</w:t>
       </w:r>
     </w:p>
     <w:bookmarkEnd w:id="33"/>

</xml_diff>